<commit_message>
docs: revert class name changes and add citation
</commit_message>
<xml_diff>
--- a/doc/MycorrhizaFinder ErM Classification Guidelines.docx
+++ b/doc/MycorrhizaFinder ErM Classification Guidelines.docx
@@ -5,23 +5,44 @@
     <w:p>
       <w:pPr>
         <w:pStyle w:val="Title"/>
+        <w:rPr>
+          <w:lang w:val="en-GB"/>
+        </w:rPr>
       </w:pPr>
       <w:r>
+        <w:rPr>
+          <w:lang w:val="en-GB"/>
+        </w:rPr>
         <w:t xml:space="preserve">MycorrhizaFinder </w:t>
       </w:r>
       <w:r>
+        <w:rPr>
+          <w:lang w:val="en-GB"/>
+        </w:rPr>
         <w:t>ErM</w:t>
       </w:r>
       <w:r>
+        <w:rPr>
+          <w:lang w:val="en-GB"/>
+        </w:rPr>
         <w:t xml:space="preserve"> Classif</w:t>
       </w:r>
       <w:r>
+        <w:rPr>
+          <w:lang w:val="en-GB"/>
+        </w:rPr>
         <w:t>i</w:t>
       </w:r>
       <w:r>
+        <w:rPr>
+          <w:lang w:val="en-GB"/>
+        </w:rPr>
         <w:t xml:space="preserve">cation </w:t>
       </w:r>
       <w:r>
+        <w:rPr>
+          <w:lang w:val="en-GB"/>
+        </w:rPr>
         <w:t>Guidelines</w:t>
       </w:r>
     </w:p>
@@ -29,124 +50,72 @@
     <w:p>
       <w:pPr>
         <w:jc w:val="both"/>
-        <w:rPr>
-          <w:lang w:val="en-US"/>
-        </w:rPr>
       </w:pPr>
       <w:r>
         <w:rPr>
           <w:b/>
           <w:bCs/>
-          <w:lang w:val="en-US"/>
         </w:rPr>
         <w:t xml:space="preserve">General: </w:t>
       </w:r>
       <w:r>
-        <w:rPr>
-          <w:lang w:val="en-US"/>
-        </w:rPr>
-        <w:t>The manual labelling p</w:t>
-      </w:r>
-      <w:r>
-        <w:rPr>
-          <w:lang w:val="en-US"/>
-        </w:rPr>
-        <w:t xml:space="preserve">rocess should be guided by </w:t>
+        <w:t xml:space="preserve">The manual labelling process should be guided by </w:t>
       </w:r>
       <w:r>
         <w:rPr>
           <w:i/>
           <w:iCs/>
-          <w:lang w:val="en-US"/>
         </w:rPr>
         <w:t xml:space="preserve">clearly defined criteria </w:t>
       </w:r>
       <w:r>
-        <w:rPr>
-          <w:lang w:val="en-US"/>
-        </w:rPr>
         <w:t xml:space="preserve">whilst being </w:t>
       </w:r>
       <w:r>
         <w:rPr>
           <w:i/>
           <w:iCs/>
-          <w:lang w:val="en-US"/>
         </w:rPr>
         <w:t>intuitive</w:t>
       </w:r>
       <w:r>
-        <w:rPr>
-          <w:lang w:val="en-US"/>
-        </w:rPr>
         <w:t>. Given a</w:t>
       </w:r>
       <w:r>
-        <w:rPr>
-          <w:lang w:val="en-US"/>
-        </w:rPr>
         <w:t xml:space="preserve"> central</w:t>
       </w:r>
       <w:r>
-        <w:rPr>
-          <w:lang w:val="en-US"/>
-        </w:rPr>
         <w:t xml:space="preserve"> image tile, experts should label </w:t>
       </w:r>
       <w:r>
-        <w:rPr>
-          <w:lang w:val="en-US"/>
-        </w:rPr>
         <w:t xml:space="preserve">as though assessing through a microscope </w:t>
       </w:r>
       <w:r>
-        <w:rPr>
-          <w:lang w:val="en-US"/>
-        </w:rPr>
         <w:t xml:space="preserve">given the </w:t>
       </w:r>
       <w:r>
-        <w:rPr>
-          <w:lang w:val="en-US"/>
-        </w:rPr>
         <w:t xml:space="preserve">context of the </w:t>
       </w:r>
       <w:r>
-        <w:rPr>
-          <w:lang w:val="en-US"/>
-        </w:rPr>
         <w:t>surrounding 8 tiles</w:t>
       </w:r>
       <w:r>
-        <w:rPr>
-          <w:lang w:val="en-US"/>
-        </w:rPr>
         <w:t xml:space="preserve">, </w:t>
       </w:r>
       <w:r>
-        <w:rPr>
-          <w:lang w:val="en-US"/>
-        </w:rPr>
         <w:t xml:space="preserve">while </w:t>
       </w:r>
       <w:r>
-        <w:rPr>
-          <w:lang w:val="en-US"/>
-        </w:rPr>
         <w:t xml:space="preserve">following the guidelines presented herein. This document aims to define </w:t>
       </w:r>
       <w:r>
         <w:rPr>
           <w:i/>
           <w:iCs/>
-          <w:lang w:val="en-US"/>
         </w:rPr>
         <w:t>clear classification criteria</w:t>
       </w:r>
       <w:r>
-        <w:rPr>
-          <w:lang w:val="en-US"/>
-        </w:rPr>
         <w:t xml:space="preserve"> for all classes encountered, which can be used across numerous researchers to curate a new training dataset. </w:t>
       </w:r>
     </w:p>
@@ -241,14 +210,12 @@
               <w:rPr>
                 <w:b/>
                 <w:bCs/>
-                <w:lang w:val="en-US"/>
               </w:rPr>
             </w:pPr>
             <w:r>
               <w:rPr>
                 <w:b/>
                 <w:bCs/>
-                <w:lang w:val="en-US"/>
               </w:rPr>
               <w:t xml:space="preserve">Must exhibit </w:t>
             </w:r>
@@ -256,7 +223,6 @@
               <w:rPr>
                 <w:b/>
                 <w:bCs/>
-                <w:lang w:val="en-US"/>
               </w:rPr>
               <w:t xml:space="preserve">at least one of the </w:t>
             </w:r>
@@ -264,7 +230,6 @@
               <w:rPr>
                 <w:b/>
                 <w:bCs/>
-                <w:lang w:val="en-US"/>
               </w:rPr>
               <w:t>following image features:</w:t>
             </w:r>
@@ -277,14 +242,8 @@
                 <w:numId w:val="3"/>
               </w:numPr>
               <w:cnfStyle w:val="000000100000" w:firstRow="0" w:lastRow="0" w:firstColumn="0" w:lastColumn="0" w:oddVBand="0" w:evenVBand="0" w:oddHBand="1" w:evenHBand="0" w:firstRowFirstColumn="0" w:firstRowLastColumn="0" w:lastRowFirstColumn="0" w:lastRowLastColumn="0"/>
-              <w:rPr>
-                <w:lang w:val="en-US"/>
-              </w:rPr>
             </w:pPr>
             <w:r>
-              <w:rPr>
-                <w:lang w:val="en-US"/>
-              </w:rPr>
               <w:t>Thin, septate, blue-stained hyphal coils</w:t>
             </w:r>
           </w:p>
@@ -296,44 +255,17 @@
                 <w:numId w:val="3"/>
               </w:numPr>
               <w:cnfStyle w:val="000000100000" w:firstRow="0" w:lastRow="0" w:firstColumn="0" w:lastColumn="0" w:oddVBand="0" w:evenVBand="0" w:oddHBand="1" w:evenHBand="0" w:firstRowFirstColumn="0" w:firstRowLastColumn="0" w:lastRowFirstColumn="0" w:lastRowLastColumn="0"/>
-              <w:rPr>
-                <w:lang w:val="en-US"/>
-              </w:rPr>
             </w:pPr>
             <w:r>
-              <w:rPr>
-                <w:lang w:val="en-US"/>
-              </w:rPr>
-              <w:t xml:space="preserve">Wavy, </w:t>
+              <w:t>Wavy, s</w:t>
             </w:r>
             <w:r>
-              <w:rPr>
-                <w:lang w:val="en-US"/>
-              </w:rPr>
-              <w:t>s</w:t>
+              <w:t>eptate e</w:t>
             </w:r>
             <w:r>
-              <w:rPr>
-                <w:lang w:val="en-US"/>
-              </w:rPr>
-              <w:t>eptate</w:t>
-            </w:r>
-            <w:r>
-              <w:rPr>
-                <w:lang w:val="en-US"/>
-              </w:rPr>
-              <w:t xml:space="preserve"> e</w:t>
-            </w:r>
-            <w:r>
-              <w:rPr>
-                <w:lang w:val="en-US"/>
-              </w:rPr>
               <w:t>xtracellular hyphae</w:t>
             </w:r>
             <w:r>
-              <w:rPr>
-                <w:lang w:val="en-US"/>
-              </w:rPr>
               <w:t xml:space="preserve"> </w:t>
             </w:r>
           </w:p>
@@ -348,14 +280,12 @@
               <w:rPr>
                 <w:b/>
                 <w:bCs/>
-                <w:lang w:val="en-US"/>
               </w:rPr>
             </w:pPr>
             <w:r>
               <w:rPr>
                 <w:b/>
                 <w:bCs/>
-                <w:lang w:val="en-US"/>
               </w:rPr>
               <w:t>Amount of coloni</w:t>
             </w:r>
@@ -363,7 +293,6 @@
               <w:rPr>
                 <w:b/>
                 <w:bCs/>
-                <w:lang w:val="en-US"/>
               </w:rPr>
               <w:t>s</w:t>
             </w:r>
@@ -371,23 +300,13 @@
               <w:rPr>
                 <w:b/>
                 <w:bCs/>
-                <w:lang w:val="en-US"/>
               </w:rPr>
-              <w:t xml:space="preserve">ation </w:t>
+              <w:t>ation required</w:t>
             </w:r>
             <w:r>
               <w:rPr>
                 <w:b/>
                 <w:bCs/>
-                <w:lang w:val="en-US"/>
-              </w:rPr>
-              <w:t>required</w:t>
-            </w:r>
-            <w:r>
-              <w:rPr>
-                <w:b/>
-                <w:bCs/>
-                <w:lang w:val="en-US"/>
               </w:rPr>
               <w:t>:</w:t>
             </w:r>
@@ -402,10 +321,7 @@
               <w:cnfStyle w:val="000000100000" w:firstRow="0" w:lastRow="0" w:firstColumn="0" w:lastColumn="0" w:oddVBand="0" w:evenVBand="0" w:oddHBand="1" w:evenHBand="0" w:firstRowFirstColumn="0" w:firstRowLastColumn="0" w:lastRowFirstColumn="0" w:lastRowLastColumn="0"/>
             </w:pPr>
             <w:r>
-              <w:t xml:space="preserve">No minimum requirement but </w:t>
-            </w:r>
-            <w:r>
-              <w:t>hyphae must clearly be coiling within the confines of the cell walls</w:t>
+              <w:t>No minimum requirement but hyphae must clearly be coiling within the confines of the cell walls</w:t>
             </w:r>
           </w:p>
           <w:p>
@@ -420,14 +336,12 @@
               <w:rPr>
                 <w:b/>
                 <w:bCs/>
-                <w:lang w:val="en-US"/>
               </w:rPr>
             </w:pPr>
             <w:r>
               <w:rPr>
                 <w:b/>
                 <w:bCs/>
-                <w:lang w:val="en-US"/>
               </w:rPr>
               <w:t>Exemplary images:</w:t>
             </w:r>
@@ -438,7 +352,6 @@
               <w:rPr>
                 <w:b/>
                 <w:bCs/>
-                <w:lang w:val="en-US"/>
               </w:rPr>
             </w:pPr>
           </w:p>
@@ -447,9 +360,6 @@
               <w:cnfStyle w:val="000000100000" w:firstRow="0" w:lastRow="0" w:firstColumn="0" w:lastColumn="0" w:oddVBand="0" w:evenVBand="0" w:oddHBand="1" w:evenHBand="0" w:firstRowFirstColumn="0" w:firstRowLastColumn="0" w:lastRowFirstColumn="0" w:lastRowLastColumn="0"/>
             </w:pPr>
             <w:r>
-              <w:rPr>
-                <w:noProof/>
-              </w:rPr>
               <w:drawing>
                 <wp:inline distT="0" distB="0" distL="0" distR="0" wp14:anchorId="75481436" wp14:editId="7EEDC110">
                   <wp:extent cx="3629025" cy="1571625"/>
@@ -499,14 +409,12 @@
               <w:rPr>
                 <w:b/>
                 <w:bCs/>
-                <w:lang w:val="en-US"/>
               </w:rPr>
             </w:pPr>
             <w:r>
               <w:rPr>
                 <w:b/>
                 <w:bCs/>
-                <w:lang w:val="en-US"/>
               </w:rPr>
               <w:t>Other aspects to be aware of:</w:t>
             </w:r>
@@ -566,9 +474,6 @@
               <w:cnfStyle w:val="000000100000" w:firstRow="0" w:lastRow="0" w:firstColumn="0" w:lastColumn="0" w:oddVBand="0" w:evenVBand="0" w:oddHBand="1" w:evenHBand="0" w:firstRowFirstColumn="0" w:firstRowLastColumn="0" w:lastRowFirstColumn="0" w:lastRowLastColumn="0"/>
             </w:pPr>
             <w:r>
-              <w:rPr>
-                <w:lang w:val="en-US"/>
-              </w:rPr>
               <w:t>Relevant in hair roots only</w:t>
             </w:r>
             <w:r>
@@ -603,14 +508,12 @@
               <w:rPr>
                 <w:b/>
                 <w:bCs/>
-                <w:lang w:val="en-US"/>
               </w:rPr>
             </w:pPr>
             <w:r>
               <w:rPr>
                 <w:b/>
                 <w:bCs/>
-                <w:lang w:val="en-US"/>
               </w:rPr>
               <w:t xml:space="preserve">Must exhibit at least one of the following image features: </w:t>
             </w:r>
@@ -626,13 +529,9 @@
               <w:rPr>
                 <w:b/>
                 <w:bCs/>
-                <w:lang w:val="en-US"/>
               </w:rPr>
             </w:pPr>
             <w:r>
-              <w:rPr>
-                <w:lang w:val="en-US"/>
-              </w:rPr>
               <w:t>Thin septate brown hyphal coils</w:t>
             </w:r>
           </w:p>
@@ -644,38 +543,20 @@
                 <w:numId w:val="17"/>
               </w:numPr>
               <w:cnfStyle w:val="000000000000" w:firstRow="0" w:lastRow="0" w:firstColumn="0" w:lastColumn="0" w:oddVBand="0" w:evenVBand="0" w:oddHBand="0" w:evenHBand="0" w:firstRowFirstColumn="0" w:firstRowLastColumn="0" w:lastRowFirstColumn="0" w:lastRowLastColumn="0"/>
-              <w:rPr>
-                <w:lang w:val="en-US"/>
-              </w:rPr>
             </w:pPr>
             <w:r>
-              <w:rPr>
-                <w:lang w:val="en-US"/>
-              </w:rPr>
               <w:t>St</w:t>
             </w:r>
             <w:r>
-              <w:rPr>
-                <w:lang w:val="en-US"/>
-              </w:rPr>
               <w:t>andard</w:t>
             </w:r>
             <w:r>
-              <w:rPr>
-                <w:lang w:val="en-US"/>
-              </w:rPr>
               <w:t xml:space="preserve"> brown </w:t>
             </w:r>
             <w:r>
-              <w:rPr>
-                <w:lang w:val="en-US"/>
-              </w:rPr>
               <w:t>e</w:t>
             </w:r>
             <w:r>
-              <w:rPr>
-                <w:lang w:val="en-US"/>
-              </w:rPr>
               <w:t>xtracellular hyphae</w:t>
             </w:r>
           </w:p>
@@ -685,7 +566,6 @@
               <w:rPr>
                 <w:b/>
                 <w:bCs/>
-                <w:lang w:val="en-US"/>
               </w:rPr>
             </w:pPr>
           </w:p>
@@ -695,14 +575,12 @@
               <w:rPr>
                 <w:b/>
                 <w:bCs/>
-                <w:lang w:val="en-US"/>
               </w:rPr>
             </w:pPr>
             <w:r>
               <w:rPr>
                 <w:b/>
                 <w:bCs/>
-                <w:lang w:val="en-US"/>
               </w:rPr>
               <w:t>Amount of coloni</w:t>
             </w:r>
@@ -710,7 +588,6 @@
               <w:rPr>
                 <w:b/>
                 <w:bCs/>
-                <w:lang w:val="en-US"/>
               </w:rPr>
               <w:t>s</w:t>
             </w:r>
@@ -718,7 +595,6 @@
               <w:rPr>
                 <w:b/>
                 <w:bCs/>
-                <w:lang w:val="en-US"/>
               </w:rPr>
               <w:t>ation required:</w:t>
             </w:r>
@@ -734,22 +610,15 @@
               <w:rPr>
                 <w:b/>
                 <w:bCs/>
-                <w:lang w:val="en-US"/>
               </w:rPr>
             </w:pPr>
             <w:r>
-              <w:t xml:space="preserve">No minimum requirement but </w:t>
-            </w:r>
-            <w:r>
-              <w:t>hyphae must clearly be coiling within the confines of the cell walls</w:t>
+              <w:t>No minimum requirement but hyphae must clearly be coiling within the confines of the cell walls</w:t>
             </w:r>
           </w:p>
           <w:p>
             <w:pPr>
               <w:cnfStyle w:val="000000000000" w:firstRow="0" w:lastRow="0" w:firstColumn="0" w:lastColumn="0" w:oddVBand="0" w:evenVBand="0" w:oddHBand="0" w:evenHBand="0" w:firstRowFirstColumn="0" w:firstRowLastColumn="0" w:lastRowFirstColumn="0" w:lastRowLastColumn="0"/>
-              <w:rPr>
-                <w:lang w:val="en-US"/>
-              </w:rPr>
             </w:pPr>
             <w:r>
               <w:br/>
@@ -761,7 +630,6 @@
               <w:rPr>
                 <w:b/>
                 <w:bCs/>
-                <w:lang w:val="en-US"/>
               </w:rPr>
               <w:t>Exemplary images:</w:t>
             </w:r>
@@ -772,13 +640,9 @@
               <w:rPr>
                 <w:b/>
                 <w:bCs/>
-                <w:lang w:val="en-US"/>
               </w:rPr>
             </w:pPr>
             <w:r>
-              <w:rPr>
-                <w:noProof/>
-              </w:rPr>
               <w:drawing>
                 <wp:inline distT="0" distB="0" distL="0" distR="0" wp14:anchorId="55C4705B" wp14:editId="284F520C">
                   <wp:extent cx="3629025" cy="1819275"/>
@@ -828,7 +692,6 @@
               <w:rPr>
                 <w:b/>
                 <w:bCs/>
-                <w:lang w:val="en-US"/>
               </w:rPr>
               <w:t>Other aspects to be aware of:</w:t>
             </w:r>
@@ -858,7 +721,6 @@
               <w:rPr>
                 <w:b/>
                 <w:bCs/>
-                <w:lang w:val="en-US"/>
               </w:rPr>
             </w:pPr>
             <w:r>
@@ -873,21 +735,9 @@
                 <w:numId w:val="17"/>
               </w:numPr>
               <w:cnfStyle w:val="000000000000" w:firstRow="0" w:lastRow="0" w:firstColumn="0" w:lastColumn="0" w:oddVBand="0" w:evenVBand="0" w:oddHBand="0" w:evenHBand="0" w:firstRowFirstColumn="0" w:firstRowLastColumn="0" w:lastRowFirstColumn="0" w:lastRowLastColumn="0"/>
-              <w:rPr>
-                <w:lang w:val="en-US"/>
-              </w:rPr>
             </w:pPr>
             <w:r>
-              <w:rPr>
-                <w:lang w:val="en-US"/>
-              </w:rPr>
-              <w:t xml:space="preserve">Relevant </w:t>
-            </w:r>
-            <w:r>
-              <w:rPr>
-                <w:lang w:val="en-US"/>
-              </w:rPr>
-              <w:t>in hair roots only</w:t>
+              <w:t>Relevant in hair roots only</w:t>
             </w:r>
           </w:p>
           <w:p>
@@ -897,16 +747,12 @@
               <w:rPr>
                 <w:b/>
                 <w:bCs/>
-                <w:lang w:val="en-US"/>
               </w:rPr>
             </w:pPr>
           </w:p>
           <w:p>
             <w:pPr>
               <w:cnfStyle w:val="000000000000" w:firstRow="0" w:lastRow="0" w:firstColumn="0" w:lastColumn="0" w:oddVBand="0" w:evenVBand="0" w:oddHBand="0" w:evenHBand="0" w:firstRowFirstColumn="0" w:firstRowLastColumn="0" w:lastRowFirstColumn="0" w:lastRowLastColumn="0"/>
-              <w:rPr>
-                <w:lang w:val="en-US"/>
-              </w:rPr>
             </w:pPr>
             <w:r>
               <w:br/>
@@ -942,14 +788,12 @@
               <w:rPr>
                 <w:b/>
                 <w:bCs/>
-                <w:lang w:val="en-US"/>
               </w:rPr>
             </w:pPr>
             <w:r>
               <w:rPr>
                 <w:b/>
                 <w:bCs/>
-                <w:lang w:val="en-US"/>
               </w:rPr>
               <w:t>Must exhibit following image features:</w:t>
             </w:r>
@@ -962,23 +806,14 @@
                 <w:numId w:val="23"/>
               </w:numPr>
               <w:cnfStyle w:val="000000100000" w:firstRow="0" w:lastRow="0" w:firstColumn="0" w:lastColumn="0" w:oddVBand="0" w:evenVBand="0" w:oddHBand="1" w:evenHBand="0" w:firstRowFirstColumn="0" w:firstRowLastColumn="0" w:lastRowFirstColumn="0" w:lastRowLastColumn="0"/>
-              <w:rPr>
-                <w:lang w:val="en-US"/>
-              </w:rPr>
             </w:pPr>
             <w:r>
-              <w:rPr>
-                <w:lang w:val="en-US"/>
-              </w:rPr>
               <w:t>Thick, septate, wavy extracellular hyphae; stains blue</w:t>
             </w:r>
           </w:p>
           <w:p>
             <w:pPr>
               <w:cnfStyle w:val="000000100000" w:firstRow="0" w:lastRow="0" w:firstColumn="0" w:lastColumn="0" w:oddVBand="0" w:evenVBand="0" w:oddHBand="1" w:evenHBand="0" w:firstRowFirstColumn="0" w:firstRowLastColumn="0" w:lastRowFirstColumn="0" w:lastRowLastColumn="0"/>
-              <w:rPr>
-                <w:lang w:val="en-US"/>
-              </w:rPr>
             </w:pPr>
           </w:p>
           <w:p>
@@ -987,14 +822,12 @@
               <w:rPr>
                 <w:b/>
                 <w:bCs/>
-                <w:lang w:val="en-US"/>
               </w:rPr>
             </w:pPr>
             <w:r>
               <w:rPr>
                 <w:b/>
                 <w:bCs/>
-                <w:lang w:val="en-US"/>
               </w:rPr>
               <w:t>Amount of coloni</w:t>
             </w:r>
@@ -1002,7 +835,6 @@
               <w:rPr>
                 <w:b/>
                 <w:bCs/>
-                <w:lang w:val="en-US"/>
               </w:rPr>
               <w:t>s</w:t>
             </w:r>
@@ -1010,7 +842,6 @@
               <w:rPr>
                 <w:b/>
                 <w:bCs/>
-                <w:lang w:val="en-US"/>
               </w:rPr>
               <w:t>ation required</w:t>
             </w:r>
@@ -1018,7 +849,6 @@
               <w:rPr>
                 <w:b/>
                 <w:bCs/>
-                <w:lang w:val="en-US"/>
               </w:rPr>
               <w:t>:</w:t>
             </w:r>
@@ -1031,15 +861,9 @@
                 <w:numId w:val="20"/>
               </w:numPr>
               <w:cnfStyle w:val="000000100000" w:firstRow="0" w:lastRow="0" w:firstColumn="0" w:lastColumn="0" w:oddVBand="0" w:evenVBand="0" w:oddHBand="1" w:evenHBand="0" w:firstRowFirstColumn="0" w:firstRowLastColumn="0" w:lastRowFirstColumn="0" w:lastRowLastColumn="0"/>
-              <w:rPr>
-                <w:lang w:val="en-US"/>
-              </w:rPr>
             </w:pPr>
             <w:r>
-              <w:t xml:space="preserve">No minimum requirement but </w:t>
-            </w:r>
-            <w:r>
-              <w:t>hyphae must clearly be coiling within the confines of the cell walls</w:t>
+              <w:t>No minimum requirement but hyphae must clearly be coiling within the confines of the cell walls</w:t>
             </w:r>
             <w:r>
               <w:br/>
@@ -1051,7 +875,6 @@
               <w:rPr>
                 <w:b/>
                 <w:bCs/>
-                <w:lang w:val="en-US"/>
               </w:rPr>
             </w:pPr>
             <w:r>
@@ -1061,7 +884,6 @@
               <w:rPr>
                 <w:b/>
                 <w:bCs/>
-                <w:lang w:val="en-US"/>
               </w:rPr>
               <w:t>Exemplary images:</w:t>
             </w:r>
@@ -1071,9 +893,6 @@
               <w:cnfStyle w:val="000000100000" w:firstRow="0" w:lastRow="0" w:firstColumn="0" w:lastColumn="0" w:oddVBand="0" w:evenVBand="0" w:oddHBand="1" w:evenHBand="0" w:firstRowFirstColumn="0" w:firstRowLastColumn="0" w:lastRowFirstColumn="0" w:lastRowLastColumn="0"/>
             </w:pPr>
             <w:r>
-              <w:rPr>
-                <w:noProof/>
-              </w:rPr>
               <w:lastRenderedPageBreak/>
               <w:drawing>
                 <wp:inline distT="0" distB="0" distL="0" distR="0" wp14:anchorId="39089549" wp14:editId="0911E382">
@@ -1124,14 +943,12 @@
               <w:rPr>
                 <w:b/>
                 <w:bCs/>
-                <w:lang w:val="en-US"/>
               </w:rPr>
             </w:pPr>
             <w:r>
               <w:rPr>
                 <w:b/>
                 <w:bCs/>
-                <w:lang w:val="en-US"/>
               </w:rPr>
               <w:t>Other aspects to be aware of:</w:t>
             </w:r>
@@ -1144,21 +961,9 @@
                 <w:numId w:val="22"/>
               </w:numPr>
               <w:cnfStyle w:val="000000100000" w:firstRow="0" w:lastRow="0" w:firstColumn="0" w:lastColumn="0" w:oddVBand="0" w:evenVBand="0" w:oddHBand="1" w:evenHBand="0" w:firstRowFirstColumn="0" w:firstRowLastColumn="0" w:lastRowFirstColumn="0" w:lastRowLastColumn="0"/>
-              <w:rPr>
-                <w:lang w:val="en-US"/>
-              </w:rPr>
             </w:pPr>
             <w:r>
-              <w:rPr>
-                <w:lang w:val="en-US"/>
-              </w:rPr>
-              <w:t xml:space="preserve">Relevant </w:t>
-            </w:r>
-            <w:r>
-              <w:rPr>
-                <w:lang w:val="en-US"/>
-              </w:rPr>
-              <w:t>in hair roots only</w:t>
+              <w:t>Relevant in hair roots only</w:t>
             </w:r>
           </w:p>
           <w:p>
@@ -1169,9 +974,6 @@
                 <w:numId w:val="22"/>
               </w:numPr>
               <w:cnfStyle w:val="000000100000" w:firstRow="0" w:lastRow="0" w:firstColumn="0" w:lastColumn="0" w:oddVBand="0" w:evenVBand="0" w:oddHBand="1" w:evenHBand="0" w:firstRowFirstColumn="0" w:firstRowLastColumn="0" w:lastRowFirstColumn="0" w:lastRowLastColumn="0"/>
-              <w:rPr>
-                <w:lang w:val="en-US"/>
-              </w:rPr>
             </w:pPr>
             <w:r>
               <w:t>Can look like DSE, but blue-staining</w:t>
@@ -1220,14 +1022,12 @@
               <w:rPr>
                 <w:b/>
                 <w:bCs/>
-                <w:lang w:val="en-US"/>
               </w:rPr>
             </w:pPr>
             <w:r>
               <w:rPr>
                 <w:b/>
                 <w:bCs/>
-                <w:lang w:val="en-US"/>
               </w:rPr>
               <w:t>Must exhibit the following image features:</w:t>
             </w:r>
@@ -1243,13 +1043,9 @@
               <w:rPr>
                 <w:b/>
                 <w:bCs/>
-                <w:lang w:val="en-US"/>
               </w:rPr>
             </w:pPr>
             <w:r>
-              <w:rPr>
-                <w:lang w:val="en-US"/>
-              </w:rPr>
               <w:t>Lack of blue, brown, or Type-2 coils</w:t>
             </w:r>
           </w:p>
@@ -1261,23 +1057,14 @@
                 <w:numId w:val="24"/>
               </w:numPr>
               <w:cnfStyle w:val="000000000000" w:firstRow="0" w:lastRow="0" w:firstColumn="0" w:lastColumn="0" w:oddVBand="0" w:evenVBand="0" w:oddHBand="0" w:evenHBand="0" w:firstRowFirstColumn="0" w:firstRowLastColumn="0" w:lastRowFirstColumn="0" w:lastRowLastColumn="0"/>
-              <w:rPr>
-                <w:lang w:val="en-US"/>
-              </w:rPr>
             </w:pPr>
             <w:r>
-              <w:rPr>
-                <w:lang w:val="en-US"/>
-              </w:rPr>
               <w:t>Lack of DSE</w:t>
             </w:r>
           </w:p>
           <w:p>
             <w:pPr>
               <w:cnfStyle w:val="000000000000" w:firstRow="0" w:lastRow="0" w:firstColumn="0" w:lastColumn="0" w:oddVBand="0" w:evenVBand="0" w:oddHBand="0" w:evenHBand="0" w:firstRowFirstColumn="0" w:firstRowLastColumn="0" w:lastRowFirstColumn="0" w:lastRowLastColumn="0"/>
-              <w:rPr>
-                <w:lang w:val="en-US"/>
-              </w:rPr>
             </w:pPr>
           </w:p>
           <w:p>
@@ -1286,14 +1073,12 @@
               <w:rPr>
                 <w:b/>
                 <w:bCs/>
-                <w:lang w:val="en-US"/>
               </w:rPr>
             </w:pPr>
             <w:r>
               <w:rPr>
                 <w:b/>
                 <w:bCs/>
-                <w:lang w:val="en-US"/>
               </w:rPr>
               <w:t>Amount required:</w:t>
             </w:r>
@@ -1309,13 +1094,9 @@
               <w:rPr>
                 <w:b/>
                 <w:bCs/>
-                <w:lang w:val="en-US"/>
               </w:rPr>
             </w:pPr>
             <w:r>
-              <w:rPr>
-                <w:lang w:val="en-US"/>
-              </w:rPr>
               <w:t>At least 10% of tile contains root</w:t>
             </w:r>
           </w:p>
@@ -1325,22 +1106,17 @@
               <w:rPr>
                 <w:b/>
                 <w:bCs/>
-                <w:lang w:val="en-US"/>
               </w:rPr>
             </w:pPr>
           </w:p>
           <w:p>
             <w:pPr>
               <w:cnfStyle w:val="000000000000" w:firstRow="0" w:lastRow="0" w:firstColumn="0" w:lastColumn="0" w:oddVBand="0" w:evenVBand="0" w:oddHBand="0" w:evenHBand="0" w:firstRowFirstColumn="0" w:firstRowLastColumn="0" w:lastRowFirstColumn="0" w:lastRowLastColumn="0"/>
-              <w:rPr>
-                <w:lang w:val="en-US"/>
-              </w:rPr>
             </w:pPr>
             <w:r>
               <w:rPr>
                 <w:b/>
                 <w:bCs/>
-                <w:lang w:val="en-US"/>
               </w:rPr>
               <w:t>Exemplary images:</w:t>
             </w:r>
@@ -1350,15 +1126,9 @@
               <w:cnfStyle w:val="000000000000" w:firstRow="0" w:lastRow="0" w:firstColumn="0" w:lastColumn="0" w:oddVBand="0" w:evenVBand="0" w:oddHBand="0" w:evenHBand="0" w:firstRowFirstColumn="0" w:firstRowLastColumn="0" w:lastRowFirstColumn="0" w:lastRowLastColumn="0"/>
             </w:pPr>
             <w:r>
-              <w:rPr>
-                <w:lang w:val="en-GB"/>
-              </w:rPr>
               <w:t> </w:t>
             </w:r>
             <w:r>
-              <w:rPr>
-                <w:noProof/>
-              </w:rPr>
               <w:drawing>
                 <wp:inline distT="0" distB="0" distL="0" distR="0" wp14:anchorId="1A1533EA" wp14:editId="10EC1937">
                   <wp:extent cx="3629025" cy="2619375"/>
@@ -1405,21 +1175,9 @@
           <w:p>
             <w:pPr>
               <w:cnfStyle w:val="000000000000" w:firstRow="0" w:lastRow="0" w:firstColumn="0" w:lastColumn="0" w:oddVBand="0" w:evenVBand="0" w:oddHBand="0" w:evenHBand="0" w:firstRowFirstColumn="0" w:firstRowLastColumn="0" w:lastRowFirstColumn="0" w:lastRowLastColumn="0"/>
-              <w:rPr>
-                <w:lang w:val="en-GB"/>
-              </w:rPr>
             </w:pPr>
             <w:r>
-              <w:rPr>
-                <w:lang w:val="en-US"/>
-              </w:rPr>
-              <w:t>May contain:</w:t>
-            </w:r>
-            <w:r>
-              <w:rPr>
-                <w:lang w:val="en-GB"/>
-              </w:rPr>
-              <w:t> </w:t>
+              <w:t>May contain: </w:t>
             </w:r>
           </w:p>
           <w:p>
@@ -1430,21 +1188,9 @@
                 <w:numId w:val="24"/>
               </w:numPr>
               <w:cnfStyle w:val="000000000000" w:firstRow="0" w:lastRow="0" w:firstColumn="0" w:lastColumn="0" w:oddVBand="0" w:evenVBand="0" w:oddHBand="0" w:evenHBand="0" w:firstRowFirstColumn="0" w:firstRowLastColumn="0" w:lastRowFirstColumn="0" w:lastRowLastColumn="0"/>
-              <w:rPr>
-                <w:lang w:val="en-US"/>
-              </w:rPr>
             </w:pPr>
             <w:r>
-              <w:rPr>
-                <w:lang w:val="en-US"/>
-              </w:rPr>
-              <w:t xml:space="preserve">Relevant </w:t>
-            </w:r>
-            <w:r>
-              <w:rPr>
-                <w:lang w:val="en-US"/>
-              </w:rPr>
-              <w:t>in hair roots only</w:t>
+              <w:t>Relevant in hair roots only</w:t>
             </w:r>
           </w:p>
           <w:p>
@@ -1455,20 +1201,11 @@
                 <w:numId w:val="24"/>
               </w:numPr>
               <w:cnfStyle w:val="000000000000" w:firstRow="0" w:lastRow="0" w:firstColumn="0" w:lastColumn="0" w:oddVBand="0" w:evenVBand="0" w:oddHBand="0" w:evenHBand="0" w:firstRowFirstColumn="0" w:firstRowLastColumn="0" w:lastRowFirstColumn="0" w:lastRowLastColumn="0"/>
-              <w:rPr>
-                <w:lang w:val="en-GB"/>
-              </w:rPr>
             </w:pPr>
             <w:r>
-              <w:rPr>
-                <w:lang w:val="en-US"/>
-              </w:rPr>
               <w:t>Sclerotia, Bacteria</w:t>
             </w:r>
             <w:r>
-              <w:rPr>
-                <w:lang w:val="en-US"/>
-              </w:rPr>
               <w:t>, unidentified structures</w:t>
             </w:r>
           </w:p>
@@ -1480,26 +1217,14 @@
                 <w:numId w:val="24"/>
               </w:numPr>
               <w:cnfStyle w:val="000000000000" w:firstRow="0" w:lastRow="0" w:firstColumn="0" w:lastColumn="0" w:oddVBand="0" w:evenVBand="0" w:oddHBand="0" w:evenHBand="0" w:firstRowFirstColumn="0" w:firstRowLastColumn="0" w:lastRowFirstColumn="0" w:lastRowLastColumn="0"/>
-              <w:rPr>
-                <w:lang w:val="en-GB"/>
-              </w:rPr>
             </w:pPr>
             <w:r>
-              <w:rPr>
-                <w:lang w:val="en-US"/>
-              </w:rPr>
               <w:t xml:space="preserve">May have </w:t>
             </w:r>
             <w:r>
-              <w:rPr>
-                <w:lang w:val="en-US"/>
-              </w:rPr>
               <w:t xml:space="preserve">blue or brown </w:t>
             </w:r>
             <w:r>
-              <w:rPr>
-                <w:lang w:val="en-US"/>
-              </w:rPr>
               <w:t>extracellular hyphae over the top</w:t>
             </w:r>
           </w:p>
@@ -1507,9 +1232,6 @@
             <w:pPr>
               <w:pStyle w:val="ListParagraph"/>
               <w:cnfStyle w:val="000000000000" w:firstRow="0" w:lastRow="0" w:firstColumn="0" w:lastColumn="0" w:oddVBand="0" w:evenVBand="0" w:oddHBand="0" w:evenHBand="0" w:firstRowFirstColumn="0" w:firstRowLastColumn="0" w:lastRowFirstColumn="0" w:lastRowLastColumn="0"/>
-              <w:rPr>
-                <w:lang w:val="en-GB"/>
-              </w:rPr>
             </w:pPr>
           </w:p>
         </w:tc>
@@ -1542,14 +1264,12 @@
               <w:rPr>
                 <w:b/>
                 <w:bCs/>
-                <w:lang w:val="en-US"/>
               </w:rPr>
             </w:pPr>
             <w:r>
               <w:rPr>
                 <w:b/>
                 <w:bCs/>
-                <w:lang w:val="en-US"/>
               </w:rPr>
               <w:t>Must exhibit one of the following image features:</w:t>
             </w:r>
@@ -1562,32 +1282,17 @@
                 <w:numId w:val="21"/>
               </w:numPr>
               <w:cnfStyle w:val="000000100000" w:firstRow="0" w:lastRow="0" w:firstColumn="0" w:lastColumn="0" w:oddVBand="0" w:evenVBand="0" w:oddHBand="1" w:evenHBand="0" w:firstRowFirstColumn="0" w:firstRowLastColumn="0" w:lastRowFirstColumn="0" w:lastRowLastColumn="0"/>
-              <w:rPr>
-                <w:lang w:val="en-US"/>
-              </w:rPr>
             </w:pPr>
             <w:r>
-              <w:rPr>
-                <w:lang w:val="en-US"/>
-              </w:rPr>
               <w:t>Thick, septate, dark</w:t>
             </w:r>
             <w:r>
-              <w:rPr>
-                <w:lang w:val="en-US"/>
-              </w:rPr>
               <w:t xml:space="preserve"> brown</w:t>
             </w:r>
             <w:r>
-              <w:rPr>
-                <w:lang w:val="en-US"/>
-              </w:rPr>
               <w:t xml:space="preserve"> hyphae</w:t>
             </w:r>
             <w:r>
-              <w:rPr>
-                <w:lang w:val="en-US"/>
-              </w:rPr>
               <w:t>, irregular width</w:t>
             </w:r>
           </w:p>
@@ -1599,20 +1304,11 @@
                 <w:numId w:val="21"/>
               </w:numPr>
               <w:cnfStyle w:val="000000100000" w:firstRow="0" w:lastRow="0" w:firstColumn="0" w:lastColumn="0" w:oddVBand="0" w:evenVBand="0" w:oddHBand="1" w:evenHBand="0" w:firstRowFirstColumn="0" w:firstRowLastColumn="0" w:lastRowFirstColumn="0" w:lastRowLastColumn="0"/>
-              <w:rPr>
-                <w:lang w:val="en-US"/>
-              </w:rPr>
             </w:pPr>
             <w:r>
-              <w:rPr>
-                <w:lang w:val="en-US"/>
-              </w:rPr>
               <w:t>Dark brown m</w:t>
             </w:r>
             <w:r>
-              <w:rPr>
-                <w:lang w:val="en-US"/>
-              </w:rPr>
               <w:t>icrosclerotia/spores</w:t>
             </w:r>
           </w:p>
@@ -1624,36 +1320,21 @@
                 <w:numId w:val="21"/>
               </w:numPr>
               <w:cnfStyle w:val="000000100000" w:firstRow="0" w:lastRow="0" w:firstColumn="0" w:lastColumn="0" w:oddVBand="0" w:evenVBand="0" w:oddHBand="1" w:evenHBand="0" w:firstRowFirstColumn="0" w:firstRowLastColumn="0" w:lastRowFirstColumn="0" w:lastRowLastColumn="0"/>
-              <w:rPr>
-                <w:lang w:val="en-US"/>
-              </w:rPr>
             </w:pPr>
             <w:r>
-              <w:rPr>
-                <w:lang w:val="en-US"/>
-              </w:rPr>
               <w:lastRenderedPageBreak/>
               <w:t>Sclerotia</w:t>
             </w:r>
             <w:r>
-              <w:rPr>
-                <w:lang w:val="en-US"/>
-              </w:rPr>
               <w:t>/hyphae</w:t>
             </w:r>
             <w:r>
-              <w:rPr>
-                <w:lang w:val="en-US"/>
-              </w:rPr>
               <w:t xml:space="preserve"> within cells</w:t>
             </w:r>
           </w:p>
           <w:p>
             <w:pPr>
               <w:cnfStyle w:val="000000100000" w:firstRow="0" w:lastRow="0" w:firstColumn="0" w:lastColumn="0" w:oddVBand="0" w:evenVBand="0" w:oddHBand="1" w:evenHBand="0" w:firstRowFirstColumn="0" w:firstRowLastColumn="0" w:lastRowFirstColumn="0" w:lastRowLastColumn="0"/>
-              <w:rPr>
-                <w:lang w:val="en-US"/>
-              </w:rPr>
             </w:pPr>
           </w:p>
           <w:p>
@@ -1662,14 +1343,12 @@
               <w:rPr>
                 <w:b/>
                 <w:bCs/>
-                <w:lang w:val="en-US"/>
               </w:rPr>
             </w:pPr>
             <w:r>
               <w:rPr>
                 <w:b/>
                 <w:bCs/>
-                <w:lang w:val="en-US"/>
               </w:rPr>
               <w:t>Amount required:</w:t>
             </w:r>
@@ -1682,26 +1361,14 @@
                 <w:numId w:val="21"/>
               </w:numPr>
               <w:cnfStyle w:val="000000100000" w:firstRow="0" w:lastRow="0" w:firstColumn="0" w:lastColumn="0" w:oddVBand="0" w:evenVBand="0" w:oddHBand="1" w:evenHBand="0" w:firstRowFirstColumn="0" w:firstRowLastColumn="0" w:lastRowFirstColumn="0" w:lastRowLastColumn="0"/>
-              <w:rPr>
-                <w:lang w:val="en-US"/>
-              </w:rPr>
             </w:pPr>
             <w:r>
-              <w:rPr>
-                <w:lang w:val="en-US"/>
-              </w:rPr>
               <w:t xml:space="preserve">No minimum requirement but </w:t>
             </w:r>
             <w:r>
-              <w:rPr>
-                <w:lang w:val="en-US"/>
-              </w:rPr>
               <w:t>structures</w:t>
             </w:r>
             <w:r>
-              <w:rPr>
-                <w:lang w:val="en-US"/>
-              </w:rPr>
               <w:t xml:space="preserve"> must be clearly visible within a cell</w:t>
             </w:r>
           </w:p>
@@ -1711,7 +1378,6 @@
               <w:rPr>
                 <w:b/>
                 <w:bCs/>
-                <w:lang w:val="en-US"/>
               </w:rPr>
             </w:pPr>
             <w:r>
@@ -1721,7 +1387,6 @@
               <w:rPr>
                 <w:b/>
                 <w:bCs/>
-                <w:lang w:val="en-US"/>
               </w:rPr>
               <w:t>Exemplary images:</w:t>
             </w:r>
@@ -1731,9 +1396,6 @@
               <w:cnfStyle w:val="000000100000" w:firstRow="0" w:lastRow="0" w:firstColumn="0" w:lastColumn="0" w:oddVBand="0" w:evenVBand="0" w:oddHBand="1" w:evenHBand="0" w:firstRowFirstColumn="0" w:firstRowLastColumn="0" w:lastRowFirstColumn="0" w:lastRowLastColumn="0"/>
             </w:pPr>
             <w:r>
-              <w:rPr>
-                <w:noProof/>
-              </w:rPr>
               <w:drawing>
                 <wp:inline distT="0" distB="0" distL="0" distR="0" wp14:anchorId="30770905" wp14:editId="3C11CA3A">
                   <wp:extent cx="3629025" cy="1600200"/>
@@ -1783,14 +1445,12 @@
               <w:rPr>
                 <w:b/>
                 <w:bCs/>
-                <w:lang w:val="en-US"/>
               </w:rPr>
             </w:pPr>
             <w:r>
               <w:rPr>
                 <w:b/>
                 <w:bCs/>
-                <w:lang w:val="en-US"/>
               </w:rPr>
               <w:t>Other aspects to be aware of:</w:t>
             </w:r>
@@ -1805,20 +1465,10 @@
               <w:cnfStyle w:val="000000100000" w:firstRow="0" w:lastRow="0" w:firstColumn="0" w:lastColumn="0" w:oddVBand="0" w:evenVBand="0" w:oddHBand="1" w:evenHBand="0" w:firstRowFirstColumn="0" w:firstRowLastColumn="0" w:lastRowFirstColumn="0" w:lastRowLastColumn="0"/>
               <w:rPr>
                 <w:ins w:id="0" w:author="Elena Arrigoni" w:date="2025-02-07T12:10:00Z" w16du:dateUtc="2025-02-07T12:10:00Z"/>
-                <w:lang w:val="en-US"/>
               </w:rPr>
             </w:pPr>
             <w:r>
-              <w:rPr>
-                <w:lang w:val="en-US"/>
-              </w:rPr>
-              <w:t xml:space="preserve">Relevant </w:t>
-            </w:r>
-            <w:r>
-              <w:rPr>
-                <w:lang w:val="en-US"/>
-              </w:rPr>
-              <w:t>in hair roots only</w:t>
+              <w:t>Relevant in hair roots only</w:t>
             </w:r>
           </w:p>
           <w:p>
@@ -1829,23 +1479,14 @@
                 <w:numId w:val="21"/>
               </w:numPr>
               <w:cnfStyle w:val="000000100000" w:firstRow="0" w:lastRow="0" w:firstColumn="0" w:lastColumn="0" w:oddVBand="0" w:evenVBand="0" w:oddHBand="1" w:evenHBand="0" w:firstRowFirstColumn="0" w:firstRowLastColumn="0" w:lastRowFirstColumn="0" w:lastRowLastColumn="0"/>
-              <w:rPr>
-                <w:lang w:val="en-US"/>
-              </w:rPr>
             </w:pPr>
             <w:r>
-              <w:rPr>
-                <w:lang w:val="en-US"/>
-              </w:rPr>
               <w:t>Might look like Type II but does not stain blue.</w:t>
             </w:r>
           </w:p>
           <w:p>
             <w:pPr>
               <w:cnfStyle w:val="000000100000" w:firstRow="0" w:lastRow="0" w:firstColumn="0" w:lastColumn="0" w:oddVBand="0" w:evenVBand="0" w:oddHBand="1" w:evenHBand="0" w:firstRowFirstColumn="0" w:firstRowLastColumn="0" w:lastRowFirstColumn="0" w:lastRowLastColumn="0"/>
-              <w:rPr>
-                <w:lang w:val="en-US"/>
-              </w:rPr>
             </w:pPr>
           </w:p>
         </w:tc>
@@ -1876,14 +1517,12 @@
               <w:rPr>
                 <w:b/>
                 <w:bCs/>
-                <w:lang w:val="en-GB"/>
               </w:rPr>
             </w:pPr>
             <w:r>
               <w:rPr>
                 <w:b/>
                 <w:bCs/>
-                <w:lang w:val="en-US"/>
               </w:rPr>
               <w:t xml:space="preserve">Must exhibit the </w:t>
             </w:r>
@@ -1891,7 +1530,6 @@
               <w:rPr>
                 <w:b/>
                 <w:bCs/>
-                <w:lang w:val="en-US"/>
               </w:rPr>
               <w:t>following</w:t>
             </w:r>
@@ -1899,17 +1537,8 @@
               <w:rPr>
                 <w:b/>
                 <w:bCs/>
-                <w:lang w:val="en-US"/>
               </w:rPr>
-              <w:t xml:space="preserve"> features</w:t>
-            </w:r>
-            <w:r>
-              <w:rPr>
-                <w:b/>
-                <w:bCs/>
-                <w:lang w:val="en-GB"/>
-              </w:rPr>
-              <w:t> </w:t>
+              <w:t xml:space="preserve"> features </w:t>
             </w:r>
           </w:p>
           <w:p>
@@ -1919,21 +1548,9 @@
                 <w:numId w:val="13"/>
               </w:numPr>
               <w:cnfStyle w:val="000000000000" w:firstRow="0" w:lastRow="0" w:firstColumn="0" w:lastColumn="0" w:oddVBand="0" w:evenVBand="0" w:oddHBand="0" w:evenHBand="0" w:firstRowFirstColumn="0" w:firstRowLastColumn="0" w:lastRowFirstColumn="0" w:lastRowLastColumn="0"/>
-              <w:rPr>
-                <w:lang w:val="en-GB"/>
-              </w:rPr>
             </w:pPr>
             <w:r>
-              <w:rPr>
-                <w:lang w:val="en-US"/>
-              </w:rPr>
-              <w:t>No cell walls are visible</w:t>
-            </w:r>
-            <w:r>
-              <w:rPr>
-                <w:lang w:val="en-GB"/>
-              </w:rPr>
-              <w:t> </w:t>
+              <w:t>No cell walls are visible </w:t>
             </w:r>
           </w:p>
           <w:p>
@@ -1942,7 +1559,6 @@
               <w:rPr>
                 <w:b/>
                 <w:bCs/>
-                <w:lang w:val="en-US"/>
               </w:rPr>
             </w:pPr>
           </w:p>
@@ -1952,14 +1568,12 @@
               <w:rPr>
                 <w:b/>
                 <w:bCs/>
-                <w:lang w:val="en-GB"/>
               </w:rPr>
             </w:pPr>
             <w:r>
               <w:rPr>
                 <w:b/>
                 <w:bCs/>
-                <w:lang w:val="en-US"/>
               </w:rPr>
               <w:t>Amount required:</w:t>
             </w:r>
@@ -1972,21 +1586,9 @@
                 <w:numId w:val="13"/>
               </w:numPr>
               <w:cnfStyle w:val="000000000000" w:firstRow="0" w:lastRow="0" w:firstColumn="0" w:lastColumn="0" w:oddVBand="0" w:evenVBand="0" w:oddHBand="0" w:evenHBand="0" w:firstRowFirstColumn="0" w:firstRowLastColumn="0" w:lastRowFirstColumn="0" w:lastRowLastColumn="0"/>
-              <w:rPr>
-                <w:lang w:val="en-GB"/>
-              </w:rPr>
             </w:pPr>
             <w:r>
-              <w:rPr>
-                <w:lang w:val="en-US"/>
-              </w:rPr>
-              <w:t>Less than 10% of tile includes cell walls</w:t>
-            </w:r>
-            <w:r>
-              <w:rPr>
-                <w:lang w:val="en-GB"/>
-              </w:rPr>
-              <w:t> </w:t>
+              <w:t>Less than 10% of tile includes cell walls </w:t>
             </w:r>
           </w:p>
           <w:p>
@@ -1995,14 +1597,12 @@
               <w:rPr>
                 <w:b/>
                 <w:bCs/>
-                <w:lang w:val="en-GB"/>
               </w:rPr>
             </w:pPr>
             <w:r>
               <w:rPr>
                 <w:b/>
                 <w:bCs/>
-                <w:lang w:val="en-GB"/>
               </w:rPr>
               <w:t> </w:t>
             </w:r>
@@ -2010,25 +1610,9 @@
               <w:rPr>
                 <w:b/>
                 <w:bCs/>
-                <w:lang w:val="en-GB"/>
               </w:rPr>
               <w:br/>
-            </w:r>
-            <w:r>
-              <w:rPr>
-                <w:b/>
-                <w:bCs/>
-                <w:lang w:val="en-US"/>
-              </w:rPr>
-              <w:t>Exemplary images:</w:t>
-            </w:r>
-            <w:r>
-              <w:rPr>
-                <w:b/>
-                <w:bCs/>
-                <w:lang w:val="en-GB"/>
-              </w:rPr>
-              <w:t> </w:t>
+              <w:t>Exemplary images: </w:t>
             </w:r>
           </w:p>
           <w:p>
@@ -2037,21 +1621,16 @@
               <w:rPr>
                 <w:b/>
                 <w:bCs/>
-                <w:lang w:val="en-GB"/>
               </w:rPr>
             </w:pPr>
             <w:r>
               <w:rPr>
                 <w:b/>
                 <w:bCs/>
-                <w:lang w:val="en-GB"/>
               </w:rPr>
               <w:t> </w:t>
             </w:r>
             <w:r>
-              <w:rPr>
-                <w:noProof/>
-              </w:rPr>
               <w:drawing>
                 <wp:inline distT="0" distB="0" distL="0" distR="0" wp14:anchorId="0C0DEEB2" wp14:editId="251C7AD9">
                   <wp:extent cx="3629025" cy="866775"/>
@@ -2101,45 +1680,24 @@
               <w:rPr>
                 <w:b/>
                 <w:bCs/>
-                <w:lang w:val="en-US"/>
               </w:rPr>
-              <w:t>Other aspects to be aware of:</w:t>
-            </w:r>
-            <w:r>
-              <w:rPr>
-                <w:b/>
-                <w:bCs/>
-                <w:lang w:val="en-GB"/>
-              </w:rPr>
-              <w:t> </w:t>
+              <w:t>Other aspects to be aware of: </w:t>
             </w:r>
           </w:p>
           <w:p>
             <w:pPr>
               <w:cnfStyle w:val="000000000000" w:firstRow="0" w:lastRow="0" w:firstColumn="0" w:lastColumn="0" w:oddVBand="0" w:evenVBand="0" w:oddHBand="0" w:evenHBand="0" w:firstRowFirstColumn="0" w:firstRowLastColumn="0" w:lastRowFirstColumn="0" w:lastRowLastColumn="0"/>
-              <w:rPr>
-                <w:lang w:val="en-GB"/>
-              </w:rPr>
             </w:pPr>
             <w:r>
-              <w:rPr>
-                <w:lang w:val="en-US"/>
-              </w:rPr>
               <w:t>May include bubbles, specks of dust, flecks of dirt, extracellular hyphae</w:t>
             </w:r>
             <w:r>
-              <w:rPr>
-                <w:lang w:val="en-GB"/>
-              </w:rPr>
               <w:t>, spores and other floating fungal structures</w:t>
             </w:r>
           </w:p>
           <w:p>
             <w:pPr>
               <w:cnfStyle w:val="000000000000" w:firstRow="0" w:lastRow="0" w:firstColumn="0" w:lastColumn="0" w:oddVBand="0" w:evenVBand="0" w:oddHBand="0" w:evenHBand="0" w:firstRowFirstColumn="0" w:firstRowLastColumn="0" w:lastRowFirstColumn="0" w:lastRowLastColumn="0"/>
-              <w:rPr>
-                <w:lang w:val="en-US"/>
-              </w:rPr>
             </w:pPr>
           </w:p>
         </w:tc>
@@ -2173,14 +1731,12 @@
               <w:rPr>
                 <w:b/>
                 <w:bCs/>
-                <w:lang w:val="en-US"/>
               </w:rPr>
             </w:pPr>
             <w:r>
               <w:rPr>
                 <w:b/>
                 <w:bCs/>
-                <w:lang w:val="en-US"/>
               </w:rPr>
               <w:t xml:space="preserve">Must </w:t>
             </w:r>
@@ -2188,7 +1744,6 @@
               <w:rPr>
                 <w:b/>
                 <w:bCs/>
-                <w:lang w:val="en-US"/>
               </w:rPr>
               <w:t xml:space="preserve">exhibit the </w:t>
             </w:r>
@@ -2196,7 +1751,6 @@
               <w:rPr>
                 <w:b/>
                 <w:bCs/>
-                <w:lang w:val="en-US"/>
               </w:rPr>
               <w:t>following</w:t>
             </w:r>
@@ -2204,7 +1758,6 @@
               <w:rPr>
                 <w:b/>
                 <w:bCs/>
-                <w:lang w:val="en-US"/>
               </w:rPr>
               <w:t xml:space="preserve"> features:</w:t>
             </w:r>
@@ -2217,29 +1770,17 @@
                 <w:numId w:val="15"/>
               </w:numPr>
               <w:cnfStyle w:val="000000100000" w:firstRow="0" w:lastRow="0" w:firstColumn="0" w:lastColumn="0" w:oddVBand="0" w:evenVBand="0" w:oddHBand="1" w:evenHBand="0" w:firstRowFirstColumn="0" w:firstRowLastColumn="0" w:lastRowFirstColumn="0" w:lastRowLastColumn="0"/>
-              <w:rPr>
-                <w:lang w:val="en-US"/>
-              </w:rPr>
             </w:pPr>
             <w:r>
-              <w:rPr>
-                <w:lang w:val="en-US"/>
-              </w:rPr>
               <w:t>Larger cells</w:t>
             </w:r>
             <w:r>
-              <w:rPr>
-                <w:lang w:val="en-US"/>
-              </w:rPr>
               <w:t xml:space="preserve"> than hair roots</w:t>
             </w:r>
           </w:p>
           <w:p>
             <w:pPr>
               <w:cnfStyle w:val="000000100000" w:firstRow="0" w:lastRow="0" w:firstColumn="0" w:lastColumn="0" w:oddVBand="0" w:evenVBand="0" w:oddHBand="1" w:evenHBand="0" w:firstRowFirstColumn="0" w:firstRowLastColumn="0" w:lastRowFirstColumn="0" w:lastRowLastColumn="0"/>
-              <w:rPr>
-                <w:lang w:val="en-US"/>
-              </w:rPr>
             </w:pPr>
           </w:p>
           <w:p>
@@ -2248,14 +1789,12 @@
               <w:rPr>
                 <w:b/>
                 <w:bCs/>
-                <w:lang w:val="en-US"/>
               </w:rPr>
             </w:pPr>
             <w:r>
               <w:rPr>
                 <w:b/>
                 <w:bCs/>
-                <w:lang w:val="en-US"/>
               </w:rPr>
               <w:t>Amount required:</w:t>
             </w:r>
@@ -2268,23 +1807,14 @@
                 <w:numId w:val="18"/>
               </w:numPr>
               <w:cnfStyle w:val="000000100000" w:firstRow="0" w:lastRow="0" w:firstColumn="0" w:lastColumn="0" w:oddVBand="0" w:evenVBand="0" w:oddHBand="1" w:evenHBand="0" w:firstRowFirstColumn="0" w:firstRowLastColumn="0" w:lastRowFirstColumn="0" w:lastRowLastColumn="0"/>
-              <w:rPr>
-                <w:lang w:val="en-US"/>
-              </w:rPr>
             </w:pPr>
             <w:r>
-              <w:rPr>
-                <w:lang w:val="en-US"/>
-              </w:rPr>
               <w:t>At least 10% of tile contains root</w:t>
             </w:r>
           </w:p>
           <w:p>
             <w:pPr>
               <w:cnfStyle w:val="000000100000" w:firstRow="0" w:lastRow="0" w:firstColumn="0" w:lastColumn="0" w:oddVBand="0" w:evenVBand="0" w:oddHBand="1" w:evenHBand="0" w:firstRowFirstColumn="0" w:firstRowLastColumn="0" w:lastRowFirstColumn="0" w:lastRowLastColumn="0"/>
-              <w:rPr>
-                <w:lang w:val="en-US"/>
-              </w:rPr>
             </w:pPr>
           </w:p>
           <w:p>
@@ -2293,14 +1823,12 @@
               <w:rPr>
                 <w:b/>
                 <w:bCs/>
-                <w:lang w:val="en-US"/>
               </w:rPr>
             </w:pPr>
             <w:r>
               <w:rPr>
                 <w:b/>
                 <w:bCs/>
-                <w:lang w:val="en-US"/>
               </w:rPr>
               <w:lastRenderedPageBreak/>
               <w:t>Exemplary images</w:t>
@@ -2309,7 +1837,6 @@
               <w:rPr>
                 <w:b/>
                 <w:bCs/>
-                <w:lang w:val="en-US"/>
               </w:rPr>
               <w:t xml:space="preserve"> (small fragment of hair root included for comparison):</w:t>
             </w:r>
@@ -2317,18 +1844,14 @@
           <w:p>
             <w:pPr>
               <w:cnfStyle w:val="000000100000" w:firstRow="0" w:lastRow="0" w:firstColumn="0" w:lastColumn="0" w:oddVBand="0" w:evenVBand="0" w:oddHBand="1" w:evenHBand="0" w:firstRowFirstColumn="0" w:firstRowLastColumn="0" w:lastRowFirstColumn="0" w:lastRowLastColumn="0"/>
-              <w:rPr>
-                <w:lang w:val="en-US"/>
-              </w:rPr>
             </w:pPr>
             <w:r>
               <w:rPr>
                 <w:rFonts w:eastAsia="Times New Roman"/>
-                <w:noProof/>
                 <w:color w:val="000000"/>
               </w:rPr>
               <w:drawing>
-                <wp:anchor distT="0" distB="0" distL="114300" distR="114300" simplePos="0" relativeHeight="251658243" behindDoc="1" locked="0" layoutInCell="1" allowOverlap="1" wp14:anchorId="00A47962" wp14:editId="61DB6E52">
+                <wp:anchor distT="0" distB="0" distL="114300" distR="114300" simplePos="0" relativeHeight="251658243" behindDoc="1" locked="0" layoutInCell="1" allowOverlap="1" wp14:anchorId="00A47962" wp14:editId="6B8B7462">
                   <wp:simplePos x="0" y="0"/>
                   <wp:positionH relativeFrom="column">
                     <wp:posOffset>1270</wp:posOffset>
@@ -2407,13 +1930,9 @@
               <w:rPr>
                 <w:b/>
                 <w:bCs/>
-                <w:lang w:val="en-US"/>
               </w:rPr>
             </w:pPr>
             <w:r>
-              <w:rPr>
-                <w:noProof/>
-              </w:rPr>
               <w:drawing>
                 <wp:inline distT="0" distB="0" distL="0" distR="0" wp14:anchorId="156D0218" wp14:editId="4F4CA6C4">
                   <wp:extent cx="2257200" cy="1663333"/>
@@ -2469,7 +1988,6 @@
               <w:rPr>
                 <w:b/>
                 <w:bCs/>
-                <w:lang w:val="en-US"/>
               </w:rPr>
             </w:pPr>
           </w:p>
@@ -2479,14 +1997,12 @@
               <w:rPr>
                 <w:b/>
                 <w:bCs/>
-                <w:lang w:val="en-US"/>
               </w:rPr>
             </w:pPr>
             <w:r>
               <w:rPr>
                 <w:b/>
                 <w:bCs/>
-                <w:lang w:val="en-US"/>
               </w:rPr>
               <w:t>Other aspects to be aware of:</w:t>
             </w:r>
@@ -2499,14 +2015,8 @@
                 <w:numId w:val="15"/>
               </w:numPr>
               <w:cnfStyle w:val="000000100000" w:firstRow="0" w:lastRow="0" w:firstColumn="0" w:lastColumn="0" w:oddVBand="0" w:evenVBand="0" w:oddHBand="1" w:evenHBand="0" w:firstRowFirstColumn="0" w:firstRowLastColumn="0" w:lastRowFirstColumn="0" w:lastRowLastColumn="0"/>
-              <w:rPr>
-                <w:lang w:val="en-US"/>
-              </w:rPr>
             </w:pPr>
             <w:r>
-              <w:rPr>
-                <w:lang w:val="en-US"/>
-              </w:rPr>
               <w:t>Darker stain</w:t>
             </w:r>
           </w:p>
@@ -2518,14 +2028,8 @@
                 <w:numId w:val="15"/>
               </w:numPr>
               <w:cnfStyle w:val="000000100000" w:firstRow="0" w:lastRow="0" w:firstColumn="0" w:lastColumn="0" w:oddVBand="0" w:evenVBand="0" w:oddHBand="1" w:evenHBand="0" w:firstRowFirstColumn="0" w:firstRowLastColumn="0" w:lastRowFirstColumn="0" w:lastRowLastColumn="0"/>
-              <w:rPr>
-                <w:lang w:val="en-US"/>
-              </w:rPr>
             </w:pPr>
             <w:r>
-              <w:rPr>
-                <w:lang w:val="en-US"/>
-              </w:rPr>
               <w:t>Presence of DSE</w:t>
             </w:r>
           </w:p>
@@ -2537,14 +2041,8 @@
                 <w:numId w:val="15"/>
               </w:numPr>
               <w:cnfStyle w:val="000000100000" w:firstRow="0" w:lastRow="0" w:firstColumn="0" w:lastColumn="0" w:oddVBand="0" w:evenVBand="0" w:oddHBand="1" w:evenHBand="0" w:firstRowFirstColumn="0" w:firstRowLastColumn="0" w:lastRowFirstColumn="0" w:lastRowLastColumn="0"/>
-              <w:rPr>
-                <w:lang w:val="en-US"/>
-              </w:rPr>
             </w:pPr>
             <w:r>
-              <w:rPr>
-                <w:lang w:val="en-US"/>
-              </w:rPr>
               <w:t xml:space="preserve">Cells lignified </w:t>
             </w:r>
           </w:p>
@@ -2556,29 +2054,17 @@
                 <w:numId w:val="15"/>
               </w:numPr>
               <w:cnfStyle w:val="000000100000" w:firstRow="0" w:lastRow="0" w:firstColumn="0" w:lastColumn="0" w:oddVBand="0" w:evenVBand="0" w:oddHBand="1" w:evenHBand="0" w:firstRowFirstColumn="0" w:firstRowLastColumn="0" w:lastRowFirstColumn="0" w:lastRowLastColumn="0"/>
-              <w:rPr>
-                <w:lang w:val="en-US"/>
-              </w:rPr>
             </w:pPr>
             <w:r>
-              <w:rPr>
-                <w:lang w:val="en-US"/>
-              </w:rPr>
               <w:t>Cells more rectangular than hair root</w:t>
             </w:r>
             <w:r>
-              <w:rPr>
-                <w:lang w:val="en-US"/>
-              </w:rPr>
               <w:t xml:space="preserve"> cells</w:t>
             </w:r>
           </w:p>
           <w:p>
             <w:pPr>
               <w:cnfStyle w:val="000000100000" w:firstRow="0" w:lastRow="0" w:firstColumn="0" w:lastColumn="0" w:oddVBand="0" w:evenVBand="0" w:oddHBand="1" w:evenHBand="0" w:firstRowFirstColumn="0" w:firstRowLastColumn="0" w:lastRowFirstColumn="0" w:lastRowLastColumn="0"/>
-              <w:rPr>
-                <w:lang w:val="en-US"/>
-              </w:rPr>
             </w:pPr>
           </w:p>
         </w:tc>
@@ -2609,91 +2095,53 @@
           <w:p>
             <w:pPr>
               <w:cnfStyle w:val="000000000000" w:firstRow="0" w:lastRow="0" w:firstColumn="0" w:lastColumn="0" w:oddVBand="0" w:evenVBand="0" w:oddHBand="0" w:evenHBand="0" w:firstRowFirstColumn="0" w:firstRowLastColumn="0" w:lastRowFirstColumn="0" w:lastRowLastColumn="0"/>
-              <w:rPr>
-                <w:lang w:val="en-GB"/>
-              </w:rPr>
             </w:pPr>
             <w:r>
               <w:rPr>
                 <w:b/>
                 <w:bCs/>
-                <w:lang w:val="en-US"/>
               </w:rPr>
               <w:t>Designed for tiles that cannot be assessed by an expert.</w:t>
             </w:r>
             <w:r>
-              <w:rPr>
-                <w:lang w:val="en-US"/>
-              </w:rPr>
               <w:t xml:space="preserve"> </w:t>
             </w:r>
             <w:r>
               <w:rPr>
                 <w:b/>
                 <w:bCs/>
-                <w:lang w:val="en-US"/>
               </w:rPr>
               <w:t>May exhibit following image features:</w:t>
             </w:r>
             <w:r>
-              <w:rPr>
-                <w:lang w:val="en-GB"/>
-              </w:rPr>
               <w:t> </w:t>
             </w:r>
           </w:p>
           <w:p>
             <w:pPr>
               <w:cnfStyle w:val="000000000000" w:firstRow="0" w:lastRow="0" w:firstColumn="0" w:lastColumn="0" w:oddVBand="0" w:evenVBand="0" w:oddHBand="0" w:evenHBand="0" w:firstRowFirstColumn="0" w:firstRowLastColumn="0" w:lastRowFirstColumn="0" w:lastRowLastColumn="0"/>
-              <w:rPr>
-                <w:lang w:val="en-GB"/>
-              </w:rPr>
             </w:pPr>
             <w:r>
-              <w:rPr>
-                <w:lang w:val="en-US"/>
-              </w:rPr>
               <w:t>Structures too blurry to assess, root too obscured by dirt to assess, stain too dark to see structures, too much extracellular hyphae to determine coloni</w:t>
             </w:r>
             <w:r>
-              <w:rPr>
-                <w:lang w:val="en-US"/>
-              </w:rPr>
               <w:t>s</w:t>
             </w:r>
             <w:r>
-              <w:rPr>
-                <w:lang w:val="en-US"/>
-              </w:rPr>
-              <w:t>ation inside root, unconfirmed hyphal structures. </w:t>
+              <w:t>ation inside root, unconfirmed hyphal structures.  </w:t>
             </w:r>
+          </w:p>
+          <w:p>
+            <w:pPr>
+              <w:cnfStyle w:val="000000000000" w:firstRow="0" w:lastRow="0" w:firstColumn="0" w:lastColumn="0" w:oddVBand="0" w:evenVBand="0" w:oddHBand="0" w:evenHBand="0" w:firstRowFirstColumn="0" w:firstRowLastColumn="0" w:lastRowFirstColumn="0" w:lastRowLastColumn="0"/>
+            </w:pPr>
             <w:r>
-              <w:rPr>
-                <w:lang w:val="en-GB"/>
-              </w:rPr>
               <w:t> </w:t>
             </w:r>
           </w:p>
           <w:p>
             <w:pPr>
               <w:cnfStyle w:val="000000000000" w:firstRow="0" w:lastRow="0" w:firstColumn="0" w:lastColumn="0" w:oddVBand="0" w:evenVBand="0" w:oddHBand="0" w:evenHBand="0" w:firstRowFirstColumn="0" w:firstRowLastColumn="0" w:lastRowFirstColumn="0" w:lastRowLastColumn="0"/>
-              <w:rPr>
-                <w:lang w:val="en-GB"/>
-              </w:rPr>
-            </w:pPr>
-            <w:r>
-              <w:rPr>
-                <w:lang w:val="en-GB"/>
-              </w:rPr>
-              <w:t> </w:t>
-            </w:r>
-          </w:p>
-          <w:p>
-            <w:pPr>
-              <w:cnfStyle w:val="000000000000" w:firstRow="0" w:lastRow="0" w:firstColumn="0" w:lastColumn="0" w:oddVBand="0" w:evenVBand="0" w:oddHBand="0" w:evenHBand="0" w:firstRowFirstColumn="0" w:firstRowLastColumn="0" w:lastRowFirstColumn="0" w:lastRowLastColumn="0"/>
-              <w:rPr>
-                <w:lang w:val="en-GB"/>
-              </w:rPr>
             </w:pPr>
           </w:p>
           <w:p>
@@ -2702,14 +2150,12 @@
               <w:rPr>
                 <w:b/>
                 <w:bCs/>
-                <w:lang w:val="en-US"/>
               </w:rPr>
             </w:pPr>
             <w:r>
               <w:rPr>
                 <w:b/>
                 <w:bCs/>
-                <w:lang w:val="en-US"/>
               </w:rPr>
               <w:t>Amount required:</w:t>
             </w:r>
@@ -2725,27 +2171,17 @@
               <w:rPr>
                 <w:b/>
                 <w:bCs/>
-                <w:lang w:val="en-US"/>
               </w:rPr>
             </w:pPr>
             <w:r>
-              <w:rPr>
-                <w:lang w:val="en-GB"/>
-              </w:rPr>
               <w:t>At least 50% of the tile is unreadable</w:t>
             </w:r>
           </w:p>
           <w:p>
             <w:pPr>
               <w:cnfStyle w:val="000000000000" w:firstRow="0" w:lastRow="0" w:firstColumn="0" w:lastColumn="0" w:oddVBand="0" w:evenVBand="0" w:oddHBand="0" w:evenHBand="0" w:firstRowFirstColumn="0" w:firstRowLastColumn="0" w:lastRowFirstColumn="0" w:lastRowLastColumn="0"/>
-              <w:rPr>
-                <w:lang w:val="en-GB"/>
-              </w:rPr>
             </w:pPr>
             <w:r>
-              <w:rPr>
-                <w:lang w:val="en-GB"/>
-              </w:rPr>
               <w:t> </w:t>
             </w:r>
           </w:p>
@@ -2755,14 +2191,12 @@
               <w:rPr>
                 <w:b/>
                 <w:bCs/>
-                <w:lang w:val="en-GB"/>
               </w:rPr>
             </w:pPr>
             <w:r>
               <w:rPr>
                 <w:b/>
                 <w:bCs/>
-                <w:lang w:val="en-GB"/>
               </w:rPr>
               <w:t>Exemplary images:</w:t>
             </w:r>
@@ -2773,15 +2207,12 @@
               <w:rPr>
                 <w:b/>
                 <w:bCs/>
-                <w:lang w:val="en-GB"/>
               </w:rPr>
             </w:pPr>
             <w:r>
               <w:rPr>
                 <w:b/>
                 <w:bCs/>
-                <w:noProof/>
-                <w:lang w:val="en-US"/>
               </w:rPr>
               <w:lastRenderedPageBreak/>
               <w:drawing>
@@ -2860,7 +2291,6 @@
             <w:r>
               <w:rPr>
                 <w:rFonts w:eastAsia="Times New Roman"/>
-                <w:noProof/>
                 <w:color w:val="000000"/>
               </w:rPr>
               <w:drawing>
@@ -2939,11 +2369,10 @@
             <w:r>
               <w:rPr>
                 <w:rFonts w:eastAsia="Times New Roman"/>
-                <w:noProof/>
                 <w:color w:val="000000"/>
               </w:rPr>
               <w:drawing>
-                <wp:anchor distT="0" distB="0" distL="114300" distR="114300" simplePos="0" relativeHeight="251658241" behindDoc="1" locked="0" layoutInCell="1" allowOverlap="1" wp14:anchorId="75AAF711" wp14:editId="0E83658C">
+                <wp:anchor distT="0" distB="0" distL="114300" distR="114300" simplePos="0" relativeHeight="251658241" behindDoc="1" locked="0" layoutInCell="1" allowOverlap="1" wp14:anchorId="75AAF711" wp14:editId="4CD03B9B">
                   <wp:simplePos x="0" y="0"/>
                   <wp:positionH relativeFrom="column">
                     <wp:posOffset>1270</wp:posOffset>
@@ -3026,15 +2455,11 @@
           <w:p>
             <w:pPr>
               <w:cnfStyle w:val="000000000000" w:firstRow="0" w:lastRow="0" w:firstColumn="0" w:lastColumn="0" w:oddVBand="0" w:evenVBand="0" w:oddHBand="0" w:evenHBand="0" w:firstRowFirstColumn="0" w:firstRowLastColumn="0" w:lastRowFirstColumn="0" w:lastRowLastColumn="0"/>
-              <w:rPr>
-                <w:lang w:val="en-US"/>
-              </w:rPr>
             </w:pPr>
             <w:r>
               <w:rPr>
                 <w:b/>
                 <w:bCs/>
-                <w:lang w:val="en-US"/>
               </w:rPr>
               <w:t>Other aspects to be aware of:</w:t>
             </w:r>
@@ -3042,7 +2467,6 @@
               <w:rPr>
                 <w:b/>
                 <w:bCs/>
-                <w:lang w:val="en-US"/>
               </w:rPr>
               <w:t xml:space="preserve"> </w:t>
             </w:r>
@@ -3055,15 +2479,11 @@
                 <w:numId w:val="1"/>
               </w:numPr>
               <w:cnfStyle w:val="000000000000" w:firstRow="0" w:lastRow="0" w:firstColumn="0" w:lastColumn="0" w:oddVBand="0" w:evenVBand="0" w:oddHBand="0" w:evenHBand="0" w:firstRowFirstColumn="0" w:firstRowLastColumn="0" w:lastRowFirstColumn="0" w:lastRowLastColumn="0"/>
-              <w:rPr>
-                <w:lang w:val="en-US"/>
-              </w:rPr>
             </w:pPr>
             <w:r>
               <w:rPr>
                 <w:rFonts w:eastAsia="Roboto Slab" w:cs="Roboto Slab"/>
                 <w:color w:val="000000"/>
-                <w:lang w:val="en-US"/>
               </w:rPr>
               <w:t>Relevant in hair roots only</w:t>
             </w:r>
@@ -3071,9 +2491,6 @@
           <w:p>
             <w:pPr>
               <w:cnfStyle w:val="000000000000" w:firstRow="0" w:lastRow="0" w:firstColumn="0" w:lastColumn="0" w:oddVBand="0" w:evenVBand="0" w:oddHBand="0" w:evenHBand="0" w:firstRowFirstColumn="0" w:firstRowLastColumn="0" w:lastRowFirstColumn="0" w:lastRowLastColumn="0"/>
-              <w:rPr>
-                <w:lang w:val="en-US"/>
-              </w:rPr>
             </w:pPr>
           </w:p>
         </w:tc>
@@ -3094,10 +2511,19 @@
               <w:t>[</w:t>
             </w:r>
             <w:r>
+              <w:t>H</w:t>
+            </w:r>
+            <w:r>
               <w:t>E+</w:t>
             </w:r>
             <w:r>
               <w:t xml:space="preserve">] </w:t>
+            </w:r>
+            <w:r>
+              <w:t>Hybrid</w:t>
+            </w:r>
+            <w:r>
+              <w:t xml:space="preserve"> </w:t>
             </w:r>
             <w:r>
               <w:t>ErM</w:t>
@@ -3111,15 +2537,11 @@
           <w:p>
             <w:pPr>
               <w:cnfStyle w:val="000000100000" w:firstRow="0" w:lastRow="0" w:firstColumn="0" w:lastColumn="0" w:oddVBand="0" w:evenVBand="0" w:oddHBand="1" w:evenHBand="0" w:firstRowFirstColumn="0" w:firstRowLastColumn="0" w:lastRowFirstColumn="0" w:lastRowLastColumn="0"/>
-              <w:rPr>
-                <w:lang w:val="en-US"/>
-              </w:rPr>
             </w:pPr>
             <w:r>
               <w:rPr>
                 <w:b/>
                 <w:bCs/>
-                <w:lang w:val="en-US"/>
               </w:rPr>
               <w:t xml:space="preserve">Must exhibit </w:t>
             </w:r>
@@ -3127,15 +2549,6 @@
               <w:rPr>
                 <w:b/>
                 <w:bCs/>
-                <w:lang w:val="en-US"/>
-              </w:rPr>
-              <w:t xml:space="preserve">a </w:t>
-            </w:r>
-            <w:r>
-              <w:rPr>
-                <w:b/>
-                <w:bCs/>
-                <w:lang w:val="en-US"/>
               </w:rPr>
               <w:t>at least two</w:t>
             </w:r>
@@ -3143,7 +2556,6 @@
               <w:rPr>
                 <w:b/>
                 <w:bCs/>
-                <w:lang w:val="en-US"/>
               </w:rPr>
               <w:t xml:space="preserve"> of the following image features:</w:t>
             </w:r>
@@ -3156,26 +2568,14 @@
                 <w:numId w:val="12"/>
               </w:numPr>
               <w:cnfStyle w:val="000000100000" w:firstRow="0" w:lastRow="0" w:firstColumn="0" w:lastColumn="0" w:oddVBand="0" w:evenVBand="0" w:oddHBand="1" w:evenHBand="0" w:firstRowFirstColumn="0" w:firstRowLastColumn="0" w:lastRowFirstColumn="0" w:lastRowLastColumn="0"/>
-              <w:rPr>
-                <w:lang w:val="en-US"/>
-              </w:rPr>
             </w:pPr>
             <w:r>
-              <w:rPr>
-                <w:lang w:val="en-US"/>
-              </w:rPr>
               <w:t>B</w:t>
             </w:r>
             <w:r>
-              <w:rPr>
-                <w:lang w:val="en-US"/>
-              </w:rPr>
               <w:t>lue</w:t>
             </w:r>
             <w:r>
-              <w:rPr>
-                <w:lang w:val="en-US"/>
-              </w:rPr>
               <w:t xml:space="preserve"> coils</w:t>
             </w:r>
           </w:p>
@@ -3187,20 +2587,11 @@
                 <w:numId w:val="12"/>
               </w:numPr>
               <w:cnfStyle w:val="000000100000" w:firstRow="0" w:lastRow="0" w:firstColumn="0" w:lastColumn="0" w:oddVBand="0" w:evenVBand="0" w:oddHBand="1" w:evenHBand="0" w:firstRowFirstColumn="0" w:firstRowLastColumn="0" w:lastRowFirstColumn="0" w:lastRowLastColumn="0"/>
-              <w:rPr>
-                <w:lang w:val="en-US"/>
-              </w:rPr>
             </w:pPr>
             <w:r>
-              <w:rPr>
-                <w:lang w:val="en-US"/>
-              </w:rPr>
               <w:t>B</w:t>
             </w:r>
             <w:r>
-              <w:rPr>
-                <w:lang w:val="en-US"/>
-              </w:rPr>
               <w:t>rown coils</w:t>
             </w:r>
           </w:p>
@@ -3212,81 +2603,9 @@
                 <w:numId w:val="12"/>
               </w:numPr>
               <w:cnfStyle w:val="000000100000" w:firstRow="0" w:lastRow="0" w:firstColumn="0" w:lastColumn="0" w:oddVBand="0" w:evenVBand="0" w:oddHBand="1" w:evenHBand="0" w:firstRowFirstColumn="0" w:firstRowLastColumn="0" w:lastRowFirstColumn="0" w:lastRowLastColumn="0"/>
-              <w:rPr>
-                <w:lang w:val="en-US"/>
-              </w:rPr>
             </w:pPr>
             <w:r>
-              <w:rPr>
-                <w:lang w:val="en-US"/>
-              </w:rPr>
               <w:t>Type 2</w:t>
-            </w:r>
-          </w:p>
-          <w:p>
-            <w:pPr>
-              <w:cnfStyle w:val="000000100000" w:firstRow="0" w:lastRow="0" w:firstColumn="0" w:lastColumn="0" w:oddVBand="0" w:evenVBand="0" w:oddHBand="1" w:evenHBand="0" w:firstRowFirstColumn="0" w:firstRowLastColumn="0" w:lastRowFirstColumn="0" w:lastRowLastColumn="0"/>
-              <w:rPr>
-                <w:lang w:val="en-US"/>
-              </w:rPr>
-            </w:pPr>
-          </w:p>
-          <w:p>
-            <w:pPr>
-              <w:cnfStyle w:val="000000100000" w:firstRow="0" w:lastRow="0" w:firstColumn="0" w:lastColumn="0" w:oddVBand="0" w:evenVBand="0" w:oddHBand="1" w:evenHBand="0" w:firstRowFirstColumn="0" w:firstRowLastColumn="0" w:lastRowFirstColumn="0" w:lastRowLastColumn="0"/>
-              <w:rPr>
-                <w:b/>
-                <w:bCs/>
-                <w:lang w:val="en-US"/>
-              </w:rPr>
-            </w:pPr>
-            <w:r>
-              <w:rPr>
-                <w:b/>
-                <w:bCs/>
-                <w:lang w:val="en-US"/>
-              </w:rPr>
-              <w:t>Amount</w:t>
-            </w:r>
-            <w:r>
-              <w:rPr>
-                <w:b/>
-                <w:bCs/>
-                <w:lang w:val="en-US"/>
-              </w:rPr>
-              <w:t xml:space="preserve"> </w:t>
-            </w:r>
-            <w:r>
-              <w:rPr>
-                <w:b/>
-                <w:bCs/>
-                <w:lang w:val="en-US"/>
-              </w:rPr>
-              <w:t>required</w:t>
-            </w:r>
-            <w:r>
-              <w:rPr>
-                <w:b/>
-                <w:bCs/>
-                <w:lang w:val="en-US"/>
-              </w:rPr>
-              <w:t>:</w:t>
-            </w:r>
-          </w:p>
-          <w:p>
-            <w:pPr>
-              <w:pStyle w:val="ListParagraph"/>
-              <w:numPr>
-                <w:ilvl w:val="0"/>
-                <w:numId w:val="19"/>
-              </w:numPr>
-              <w:cnfStyle w:val="000000100000" w:firstRow="0" w:lastRow="0" w:firstColumn="0" w:lastColumn="0" w:oddVBand="0" w:evenVBand="0" w:oddHBand="1" w:evenHBand="0" w:firstRowFirstColumn="0" w:firstRowLastColumn="0" w:lastRowFirstColumn="0" w:lastRowLastColumn="0"/>
-            </w:pPr>
-            <w:r>
-              <w:t xml:space="preserve">No minimum requirement but </w:t>
-            </w:r>
-            <w:r>
-              <w:t>hyphae must clearly be coiling within the confines of the cell walls</w:t>
             </w:r>
           </w:p>
           <w:p>
@@ -3300,7 +2619,54 @@
               <w:rPr>
                 <w:b/>
                 <w:bCs/>
-                <w:lang w:val="en-US"/>
+              </w:rPr>
+            </w:pPr>
+            <w:r>
+              <w:rPr>
+                <w:b/>
+                <w:bCs/>
+              </w:rPr>
+              <w:t>Amount</w:t>
+            </w:r>
+            <w:r>
+              <w:rPr>
+                <w:b/>
+                <w:bCs/>
+              </w:rPr>
+              <w:t xml:space="preserve"> </w:t>
+            </w:r>
+            <w:r>
+              <w:rPr>
+                <w:b/>
+                <w:bCs/>
+              </w:rPr>
+              <w:t>required:</w:t>
+            </w:r>
+          </w:p>
+          <w:p>
+            <w:pPr>
+              <w:pStyle w:val="ListParagraph"/>
+              <w:numPr>
+                <w:ilvl w:val="0"/>
+                <w:numId w:val="19"/>
+              </w:numPr>
+              <w:cnfStyle w:val="000000100000" w:firstRow="0" w:lastRow="0" w:firstColumn="0" w:lastColumn="0" w:oddVBand="0" w:evenVBand="0" w:oddHBand="1" w:evenHBand="0" w:firstRowFirstColumn="0" w:firstRowLastColumn="0" w:lastRowFirstColumn="0" w:lastRowLastColumn="0"/>
+            </w:pPr>
+            <w:r>
+              <w:t>No minimum requirement but hyphae must clearly be coiling within the confines of the cell walls</w:t>
+            </w:r>
+          </w:p>
+          <w:p>
+            <w:pPr>
+              <w:cnfStyle w:val="000000100000" w:firstRow="0" w:lastRow="0" w:firstColumn="0" w:lastColumn="0" w:oddVBand="0" w:evenVBand="0" w:oddHBand="1" w:evenHBand="0" w:firstRowFirstColumn="0" w:firstRowLastColumn="0" w:lastRowFirstColumn="0" w:lastRowLastColumn="0"/>
+            </w:pPr>
+          </w:p>
+          <w:p>
+            <w:pPr>
+              <w:cnfStyle w:val="000000100000" w:firstRow="0" w:lastRow="0" w:firstColumn="0" w:lastColumn="0" w:oddVBand="0" w:evenVBand="0" w:oddHBand="1" w:evenHBand="0" w:firstRowFirstColumn="0" w:firstRowLastColumn="0" w:lastRowFirstColumn="0" w:lastRowLastColumn="0"/>
+              <w:rPr>
+                <w:b/>
+                <w:bCs/>
               </w:rPr>
             </w:pPr>
             <w:r>
@@ -3314,8 +2680,14 @@
           <w:p>
             <w:pPr>
               <w:cnfStyle w:val="000000100000" w:firstRow="0" w:lastRow="0" w:firstColumn="0" w:lastColumn="0" w:oddVBand="0" w:evenVBand="0" w:oddHBand="1" w:evenHBand="0" w:firstRowFirstColumn="0" w:firstRowLastColumn="0" w:lastRowFirstColumn="0" w:lastRowLastColumn="0"/>
+            </w:pPr>
+          </w:p>
+          <w:p>
+            <w:pPr>
+              <w:cnfStyle w:val="000000100000" w:firstRow="0" w:lastRow="0" w:firstColumn="0" w:lastColumn="0" w:oddVBand="0" w:evenVBand="0" w:oddHBand="1" w:evenHBand="0" w:firstRowFirstColumn="0" w:firstRowLastColumn="0" w:lastRowFirstColumn="0" w:lastRowLastColumn="0"/>
               <w:rPr>
-                <w:lang w:val="en-US"/>
+                <w:b/>
+                <w:bCs/>
               </w:rPr>
             </w:pPr>
           </w:p>
@@ -3325,24 +2697,9 @@
               <w:rPr>
                 <w:b/>
                 <w:bCs/>
-                <w:lang w:val="en-US"/>
-              </w:rPr>
-            </w:pPr>
-          </w:p>
-          <w:p>
-            <w:pPr>
-              <w:cnfStyle w:val="000000100000" w:firstRow="0" w:lastRow="0" w:firstColumn="0" w:lastColumn="0" w:oddVBand="0" w:evenVBand="0" w:oddHBand="1" w:evenHBand="0" w:firstRowFirstColumn="0" w:firstRowLastColumn="0" w:lastRowFirstColumn="0" w:lastRowLastColumn="0"/>
-              <w:rPr>
-                <w:b/>
-                <w:bCs/>
-                <w:lang w:val="en-US"/>
               </w:rPr>
             </w:pPr>
             <w:r>
-              <w:rPr>
-                <w:noProof/>
-                <w:lang w:val="en-US"/>
-              </w:rPr>
               <mc:AlternateContent>
                 <mc:Choice Requires="wpg">
                   <w:drawing>
@@ -3485,7 +2842,7 @@
                     </wp:anchor>
                   </w:drawing>
                 </mc:Choice>
-                <mc:Fallback xmlns:a14="http://schemas.microsoft.com/office/drawing/2010/main" xmlns:pic="http://schemas.openxmlformats.org/drawingml/2006/picture" xmlns:a="http://schemas.openxmlformats.org/drawingml/2006/main">
+                <mc:Fallback xmlns:a="http://schemas.openxmlformats.org/drawingml/2006/main" xmlns:pic="http://schemas.openxmlformats.org/drawingml/2006/picture" xmlns:a14="http://schemas.microsoft.com/office/drawing/2010/main">
                   <w:pict>
                     <v:group id="Group 11" style="position:absolute;margin-left:9.9pt;margin-top:9.1pt;width:189.35pt;height:146.7pt;z-index:251658245" coordsize="24047,18630" o:spid="_x0000_s1026" w14:anchorId="7CB9DC79" o:gfxdata="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">
                       <v:shapetype id="_x0000_t75" coordsize="21600,21600" filled="f" stroked="f" o:spt="75" o:preferrelative="t" path="m@4@5l@4@11@9@11@9@5xe">
@@ -3533,7 +2890,6 @@
               <w:rPr>
                 <w:b/>
                 <w:bCs/>
-                <w:lang w:val="en-US"/>
               </w:rPr>
             </w:pPr>
           </w:p>
@@ -3543,7 +2899,6 @@
               <w:rPr>
                 <w:b/>
                 <w:bCs/>
-                <w:lang w:val="en-US"/>
               </w:rPr>
             </w:pPr>
           </w:p>
@@ -3553,7 +2908,6 @@
               <w:rPr>
                 <w:b/>
                 <w:bCs/>
-                <w:lang w:val="en-US"/>
               </w:rPr>
             </w:pPr>
           </w:p>
@@ -3563,7 +2917,6 @@
               <w:rPr>
                 <w:b/>
                 <w:bCs/>
-                <w:lang w:val="en-US"/>
               </w:rPr>
             </w:pPr>
           </w:p>
@@ -3573,7 +2926,6 @@
               <w:rPr>
                 <w:b/>
                 <w:bCs/>
-                <w:lang w:val="en-US"/>
               </w:rPr>
             </w:pPr>
           </w:p>
@@ -3583,7 +2935,6 @@
               <w:rPr>
                 <w:b/>
                 <w:bCs/>
-                <w:lang w:val="en-US"/>
               </w:rPr>
             </w:pPr>
           </w:p>
@@ -3593,7 +2944,6 @@
               <w:rPr>
                 <w:b/>
                 <w:bCs/>
-                <w:lang w:val="en-US"/>
               </w:rPr>
             </w:pPr>
           </w:p>
@@ -3603,7 +2953,6 @@
               <w:rPr>
                 <w:b/>
                 <w:bCs/>
-                <w:lang w:val="en-US"/>
               </w:rPr>
             </w:pPr>
           </w:p>
@@ -3613,29 +2962,21 @@
               <w:rPr>
                 <w:b/>
                 <w:bCs/>
-                <w:lang w:val="en-US"/>
               </w:rPr>
             </w:pPr>
           </w:p>
           <w:p>
             <w:pPr>
               <w:cnfStyle w:val="000000100000" w:firstRow="0" w:lastRow="0" w:firstColumn="0" w:lastColumn="0" w:oddVBand="0" w:evenVBand="0" w:oddHBand="1" w:evenHBand="0" w:firstRowFirstColumn="0" w:firstRowLastColumn="0" w:lastRowFirstColumn="0" w:lastRowLastColumn="0"/>
-              <w:rPr>
-                <w:lang w:val="en-GB"/>
-              </w:rPr>
             </w:pPr>
             <w:r>
               <w:rPr>
                 <w:b/>
                 <w:bCs/>
-                <w:lang w:val="en-US"/>
               </w:rPr>
               <w:t>Other aspects to be aware of:</w:t>
             </w:r>
             <w:r>
-              <w:rPr>
-                <w:lang w:val="en-GB"/>
-              </w:rPr>
               <w:t> </w:t>
             </w:r>
           </w:p>
@@ -3647,22 +2988,10 @@
                 <w:numId w:val="22"/>
               </w:numPr>
               <w:cnfStyle w:val="000000100000" w:firstRow="0" w:lastRow="0" w:firstColumn="0" w:lastColumn="0" w:oddVBand="0" w:evenVBand="0" w:oddHBand="1" w:evenHBand="0" w:firstRowFirstColumn="0" w:firstRowLastColumn="0" w:lastRowFirstColumn="0" w:lastRowLastColumn="0"/>
-              <w:rPr>
-                <w:lang w:val="en-US"/>
-              </w:rPr>
             </w:pPr>
             <w:r>
-              <w:rPr>
-                <w:lang w:val="en-US"/>
-              </w:rPr>
               <w:lastRenderedPageBreak/>
-              <w:t xml:space="preserve">Relevant </w:t>
-            </w:r>
-            <w:r>
-              <w:rPr>
-                <w:lang w:val="en-US"/>
-              </w:rPr>
-              <w:t>in hair roots only</w:t>
+              <w:t>Relevant in hair roots only</w:t>
             </w:r>
           </w:p>
           <w:p>
@@ -3673,29 +3002,14 @@
                 <w:numId w:val="22"/>
               </w:numPr>
               <w:cnfStyle w:val="000000100000" w:firstRow="0" w:lastRow="0" w:firstColumn="0" w:lastColumn="0" w:oddVBand="0" w:evenVBand="0" w:oddHBand="1" w:evenHBand="0" w:firstRowFirstColumn="0" w:firstRowLastColumn="0" w:lastRowFirstColumn="0" w:lastRowLastColumn="0"/>
-              <w:rPr>
-                <w:lang w:val="en-US"/>
-              </w:rPr>
             </w:pPr>
             <w:r>
-              <w:rPr>
-                <w:lang w:val="en-US"/>
-              </w:rPr>
-              <w:t>One may be dominant, but if both features are visible, it should still be included in this category. </w:t>
-            </w:r>
-            <w:r>
-              <w:rPr>
-                <w:lang w:val="en-GB"/>
-              </w:rPr>
-              <w:t> </w:t>
+              <w:t>One may be dominant, but if both features are visible, it should still be included in this category.  </w:t>
             </w:r>
           </w:p>
           <w:p>
             <w:pPr>
               <w:cnfStyle w:val="000000100000" w:firstRow="0" w:lastRow="0" w:firstColumn="0" w:lastColumn="0" w:oddVBand="0" w:evenVBand="0" w:oddHBand="1" w:evenHBand="0" w:firstRowFirstColumn="0" w:firstRowLastColumn="0" w:lastRowFirstColumn="0" w:lastRowLastColumn="0"/>
-              <w:rPr>
-                <w:lang w:val="en-US"/>
-              </w:rPr>
             </w:pPr>
           </w:p>
         </w:tc>
@@ -3715,7 +3029,7 @@
               <w:t>[</w:t>
             </w:r>
             <w:r>
-              <w:t>E</w:t>
+              <w:t>H</w:t>
             </w:r>
             <w:r>
               <w:t>D+</w:t>
@@ -3724,7 +3038,7 @@
               <w:t xml:space="preserve">] </w:t>
             </w:r>
             <w:r>
-              <w:t>ErM+</w:t>
+              <w:t xml:space="preserve">Hybrid </w:t>
             </w:r>
             <w:r>
               <w:t>DSE</w:t>
@@ -3738,15 +3052,11 @@
           <w:p>
             <w:pPr>
               <w:cnfStyle w:val="000000000000" w:firstRow="0" w:lastRow="0" w:firstColumn="0" w:lastColumn="0" w:oddVBand="0" w:evenVBand="0" w:oddHBand="0" w:evenHBand="0" w:firstRowFirstColumn="0" w:firstRowLastColumn="0" w:lastRowFirstColumn="0" w:lastRowLastColumn="0"/>
-              <w:rPr>
-                <w:lang w:val="en-US"/>
-              </w:rPr>
             </w:pPr>
             <w:r>
               <w:rPr>
                 <w:b/>
                 <w:bCs/>
-                <w:lang w:val="en-US"/>
               </w:rPr>
               <w:t>Must exhibit</w:t>
             </w:r>
@@ -3754,7 +3064,6 @@
               <w:rPr>
                 <w:b/>
                 <w:bCs/>
-                <w:lang w:val="en-US"/>
               </w:rPr>
               <w:t>:</w:t>
             </w:r>
@@ -3767,14 +3076,8 @@
                 <w:numId w:val="14"/>
               </w:numPr>
               <w:cnfStyle w:val="000000000000" w:firstRow="0" w:lastRow="0" w:firstColumn="0" w:lastColumn="0" w:oddVBand="0" w:evenVBand="0" w:oddHBand="0" w:evenHBand="0" w:firstRowFirstColumn="0" w:firstRowLastColumn="0" w:lastRowFirstColumn="0" w:lastRowLastColumn="0"/>
-              <w:rPr>
-                <w:lang w:val="en-US"/>
-              </w:rPr>
             </w:pPr>
             <w:r>
-              <w:rPr>
-                <w:lang w:val="en-US"/>
-              </w:rPr>
               <w:t>Blue coils, brown coils, or Type-2</w:t>
             </w:r>
           </w:p>
@@ -3786,23 +3089,14 @@
                 <w:numId w:val="14"/>
               </w:numPr>
               <w:cnfStyle w:val="000000000000" w:firstRow="0" w:lastRow="0" w:firstColumn="0" w:lastColumn="0" w:oddVBand="0" w:evenVBand="0" w:oddHBand="0" w:evenHBand="0" w:firstRowFirstColumn="0" w:firstRowLastColumn="0" w:lastRowFirstColumn="0" w:lastRowLastColumn="0"/>
-              <w:rPr>
-                <w:lang w:val="en-US"/>
-              </w:rPr>
             </w:pPr>
             <w:r>
-              <w:rPr>
-                <w:lang w:val="en-US"/>
-              </w:rPr>
               <w:t>DSE</w:t>
             </w:r>
           </w:p>
           <w:p>
             <w:pPr>
               <w:cnfStyle w:val="000000000000" w:firstRow="0" w:lastRow="0" w:firstColumn="0" w:lastColumn="0" w:oddVBand="0" w:evenVBand="0" w:oddHBand="0" w:evenHBand="0" w:firstRowFirstColumn="0" w:firstRowLastColumn="0" w:lastRowFirstColumn="0" w:lastRowLastColumn="0"/>
-              <w:rPr>
-                <w:lang w:val="en-US"/>
-              </w:rPr>
             </w:pPr>
           </w:p>
           <w:p>
@@ -3811,14 +3105,12 @@
               <w:rPr>
                 <w:b/>
                 <w:bCs/>
-                <w:lang w:val="en-US"/>
               </w:rPr>
             </w:pPr>
             <w:r>
               <w:rPr>
                 <w:b/>
                 <w:bCs/>
-                <w:lang w:val="en-US"/>
               </w:rPr>
               <w:t xml:space="preserve">Amount </w:t>
             </w:r>
@@ -3826,7 +3118,6 @@
               <w:rPr>
                 <w:b/>
                 <w:bCs/>
-                <w:lang w:val="en-US"/>
               </w:rPr>
               <w:t>r</w:t>
             </w:r>
@@ -3834,17 +3125,8 @@
               <w:rPr>
                 <w:b/>
                 <w:bCs/>
-                <w:lang w:val="en-US"/>
               </w:rPr>
-              <w:t>equired</w:t>
-            </w:r>
-            <w:r>
-              <w:rPr>
-                <w:b/>
-                <w:bCs/>
-                <w:lang w:val="en-US"/>
-              </w:rPr>
-              <w:t>:</w:t>
+              <w:t>equired:</w:t>
             </w:r>
           </w:p>
           <w:p>
@@ -3857,10 +3139,7 @@
               <w:cnfStyle w:val="000000000000" w:firstRow="0" w:lastRow="0" w:firstColumn="0" w:lastColumn="0" w:oddVBand="0" w:evenVBand="0" w:oddHBand="0" w:evenHBand="0" w:firstRowFirstColumn="0" w:firstRowLastColumn="0" w:lastRowFirstColumn="0" w:lastRowLastColumn="0"/>
             </w:pPr>
             <w:r>
-              <w:t xml:space="preserve">No minimum requirement but </w:t>
-            </w:r>
-            <w:r>
-              <w:t>hyphae must clearly be coiling within the confines of the cell walls</w:t>
+              <w:t>No minimum requirement but hyphae must clearly be coiling within the confines of the cell walls</w:t>
             </w:r>
           </w:p>
           <w:p>
@@ -3895,7 +3174,6 @@
             <w:r>
               <w:rPr>
                 <w:rFonts w:eastAsia="Times New Roman"/>
-                <w:noProof/>
                 <w:color w:val="000000"/>
               </w:rPr>
               <w:drawing>
@@ -3953,30 +3231,20 @@
           <w:p>
             <w:pPr>
               <w:cnfStyle w:val="000000000000" w:firstRow="0" w:lastRow="0" w:firstColumn="0" w:lastColumn="0" w:oddVBand="0" w:evenVBand="0" w:oddHBand="0" w:evenHBand="0" w:firstRowFirstColumn="0" w:firstRowLastColumn="0" w:lastRowFirstColumn="0" w:lastRowLastColumn="0"/>
-              <w:rPr>
-                <w:lang w:val="en-US"/>
-              </w:rPr>
             </w:pPr>
           </w:p>
           <w:p>
             <w:pPr>
               <w:cnfStyle w:val="000000000000" w:firstRow="0" w:lastRow="0" w:firstColumn="0" w:lastColumn="0" w:oddVBand="0" w:evenVBand="0" w:oddHBand="0" w:evenHBand="0" w:firstRowFirstColumn="0" w:firstRowLastColumn="0" w:lastRowFirstColumn="0" w:lastRowLastColumn="0"/>
-              <w:rPr>
-                <w:lang w:val="en-GB"/>
-              </w:rPr>
             </w:pPr>
             <w:r>
               <w:rPr>
                 <w:b/>
                 <w:bCs/>
-                <w:lang w:val="en-US"/>
               </w:rPr>
               <w:t>Other aspects to be aware of:</w:t>
             </w:r>
             <w:r>
-              <w:rPr>
-                <w:lang w:val="en-GB"/>
-              </w:rPr>
               <w:t> </w:t>
             </w:r>
           </w:p>
@@ -3988,21 +3256,9 @@
                 <w:numId w:val="22"/>
               </w:numPr>
               <w:cnfStyle w:val="000000000000" w:firstRow="0" w:lastRow="0" w:firstColumn="0" w:lastColumn="0" w:oddVBand="0" w:evenVBand="0" w:oddHBand="0" w:evenHBand="0" w:firstRowFirstColumn="0" w:firstRowLastColumn="0" w:lastRowFirstColumn="0" w:lastRowLastColumn="0"/>
-              <w:rPr>
-                <w:lang w:val="en-US"/>
-              </w:rPr>
             </w:pPr>
             <w:r>
-              <w:rPr>
-                <w:lang w:val="en-US"/>
-              </w:rPr>
-              <w:t xml:space="preserve">Relevant </w:t>
-            </w:r>
-            <w:r>
-              <w:rPr>
-                <w:lang w:val="en-US"/>
-              </w:rPr>
-              <w:t>in hair roots only</w:t>
+              <w:t>Relevant in hair roots only</w:t>
             </w:r>
           </w:p>
           <w:p>
@@ -4013,29 +3269,14 @@
                 <w:numId w:val="22"/>
               </w:numPr>
               <w:cnfStyle w:val="000000000000" w:firstRow="0" w:lastRow="0" w:firstColumn="0" w:lastColumn="0" w:oddVBand="0" w:evenVBand="0" w:oddHBand="0" w:evenHBand="0" w:firstRowFirstColumn="0" w:firstRowLastColumn="0" w:lastRowFirstColumn="0" w:lastRowLastColumn="0"/>
-              <w:rPr>
-                <w:lang w:val="en-US"/>
-              </w:rPr>
             </w:pPr>
             <w:r>
-              <w:rPr>
-                <w:lang w:val="en-US"/>
-              </w:rPr>
-              <w:t>One may be dominant, but if both features are visible, it should still be included in this category. </w:t>
-            </w:r>
-            <w:r>
-              <w:rPr>
-                <w:lang w:val="en-GB"/>
-              </w:rPr>
-              <w:t> </w:t>
+              <w:t>One may be dominant, but if both features are visible, it should still be included in this category.  </w:t>
             </w:r>
           </w:p>
           <w:p>
             <w:pPr>
               <w:cnfStyle w:val="000000000000" w:firstRow="0" w:lastRow="0" w:firstColumn="0" w:lastColumn="0" w:oddVBand="0" w:evenVBand="0" w:oddHBand="0" w:evenHBand="0" w:firstRowFirstColumn="0" w:firstRowLastColumn="0" w:lastRowFirstColumn="0" w:lastRowLastColumn="0"/>
-              <w:rPr>
-                <w:lang w:val="en-US"/>
-              </w:rPr>
             </w:pPr>
           </w:p>
         </w:tc>
@@ -9798,6 +9039,7 @@
     </w:pPr>
     <w:rPr>
       <w:rFonts w:ascii="Roboto Slab" w:hAnsi="Roboto Slab" w:cs="Arial"/>
+      <w:lang w:val="en-GB"/>
     </w:rPr>
   </w:style>
   <w:style w:type="paragraph" w:styleId="Heading1">
@@ -46058,6 +45300,37 @@
 </file>
 
 <file path=customXml/item2.xml><?xml version="1.0" encoding="utf-8"?>
+<b:Sources xmlns:b="http://schemas.openxmlformats.org/officeDocument/2006/bibliography" xmlns="http://schemas.openxmlformats.org/officeDocument/2006/bibliography" SelectedStyle="\APA.XSL" StyleName="APA"/>
+</file>
+
+<file path=customXml/item3.xml><?xml version="1.0" encoding="utf-8"?>
+<?mso-contentType ?>
+<FormTemplates xmlns="http://schemas.microsoft.com/sharepoint/v3/contenttype/forms">
+  <Display>DocumentLibraryForm</Display>
+  <Edit>DocumentLibraryForm</Edit>
+  <New>DocumentLibraryForm</New>
+</FormTemplates>
+</file>
+
+<file path=customXml/item4.xml><?xml version="1.0" encoding="utf-8"?>
+<?mso-contentType ?>
+<SharedContentType xmlns="Microsoft.SharePoint.Taxonomy.ContentTypeSync" SourceId="4874f941-1732-4aa1-804a-4f99632a5909" ContentTypeId="0x0101" PreviousValue="false"/>
+</file>
+
+<file path=customXml/item5.xml><?xml version="1.0" encoding="utf-8"?>
+<p:properties xmlns:p="http://schemas.microsoft.com/office/2006/metadata/properties" xmlns:xsi="http://www.w3.org/2001/XMLSchema-instance" xmlns:pc="http://schemas.microsoft.com/office/infopath/2007/PartnerControls">
+  <documentManagement>
+    <lcf76f155ced4ddcb4097134ff3c332f xmlns="11a2a60f-b814-4d3a-805e-b33432740677">
+      <Terms xmlns="http://schemas.microsoft.com/office/infopath/2007/PartnerControls"/>
+    </lcf76f155ced4ddcb4097134ff3c332f>
+    <TaxCatchAll xmlns="1d5818ac-eb98-46f9-9816-1a72176be1e5" xsi:nil="true"/>
+    <Priority xmlns="11a2a60f-b814-4d3a-805e-b33432740677" xsi:nil="true"/>
+    <Descriptions xmlns="11a2a60f-b814-4d3a-805e-b33432740677" xsi:nil="true"/>
+  </documentManagement>
+</p:properties>
+</file>
+
+<file path=customXml/item6.xml><?xml version="1.0" encoding="utf-8"?>
 <ct:contentTypeSchema xmlns:ct="http://schemas.microsoft.com/office/2006/metadata/contentType" xmlns:ma="http://schemas.microsoft.com/office/2006/metadata/properties/metaAttributes" ct:_="" ma:_="" ma:contentTypeName="Document" ma:contentTypeID="0x0101004C095177B7281C4CAEBF8C204DD95D57" ma:contentTypeVersion="23" ma:contentTypeDescription="Create a new document." ma:contentTypeScope="" ma:versionID="e6f8782bb8997b4fece788bb8d2e7063">
   <xsd:schema xmlns:xsd="http://www.w3.org/2001/XMLSchema" xmlns:xs="http://www.w3.org/2001/XMLSchema" xmlns:p="http://schemas.microsoft.com/office/2006/metadata/properties" xmlns:ns2="150f78d0-e5c4-40ba-9879-1115501c63e5" xmlns:ns3="1d5818ac-eb98-46f9-9816-1a72176be1e5" xmlns:ns4="11a2a60f-b814-4d3a-805e-b33432740677" targetNamespace="http://schemas.microsoft.com/office/2006/metadata/properties" ma:root="true" ma:fieldsID="13c651943a536407126ae6d977665e58" ns2:_="" ns3:_="" ns4:_="">
     <xsd:import namespace="150f78d0-e5c4-40ba-9879-1115501c63e5"/>
@@ -46342,37 +45615,6 @@
 </ct:contentTypeSchema>
 </file>
 
-<file path=customXml/item3.xml><?xml version="1.0" encoding="utf-8"?>
-<p:properties xmlns:p="http://schemas.microsoft.com/office/2006/metadata/properties" xmlns:xsi="http://www.w3.org/2001/XMLSchema-instance" xmlns:pc="http://schemas.microsoft.com/office/infopath/2007/PartnerControls">
-  <documentManagement>
-    <lcf76f155ced4ddcb4097134ff3c332f xmlns="11a2a60f-b814-4d3a-805e-b33432740677">
-      <Terms xmlns="http://schemas.microsoft.com/office/infopath/2007/PartnerControls"/>
-    </lcf76f155ced4ddcb4097134ff3c332f>
-    <TaxCatchAll xmlns="1d5818ac-eb98-46f9-9816-1a72176be1e5" xsi:nil="true"/>
-    <Priority xmlns="11a2a60f-b814-4d3a-805e-b33432740677" xsi:nil="true"/>
-    <Descriptions xmlns="11a2a60f-b814-4d3a-805e-b33432740677" xsi:nil="true"/>
-  </documentManagement>
-</p:properties>
-</file>
-
-<file path=customXml/item4.xml><?xml version="1.0" encoding="utf-8"?>
-<?mso-contentType ?>
-<SharedContentType xmlns="Microsoft.SharePoint.Taxonomy.ContentTypeSync" SourceId="4874f941-1732-4aa1-804a-4f99632a5909" ContentTypeId="0x0101" PreviousValue="false"/>
-</file>
-
-<file path=customXml/item5.xml><?xml version="1.0" encoding="utf-8"?>
-<?mso-contentType ?>
-<FormTemplates xmlns="http://schemas.microsoft.com/sharepoint/v3/contenttype/forms">
-  <Display>DocumentLibraryForm</Display>
-  <Edit>DocumentLibraryForm</Edit>
-  <New>DocumentLibraryForm</New>
-</FormTemplates>
-</file>
-
-<file path=customXml/item6.xml><?xml version="1.0" encoding="utf-8"?>
-<b:Sources xmlns:b="http://schemas.openxmlformats.org/officeDocument/2006/bibliography" xmlns="http://schemas.openxmlformats.org/officeDocument/2006/bibliography" SelectedStyle="\APA.XSL" StyleName="APA"/>
-</file>
-
 <file path=customXml/itemProps1.xml><?xml version="1.0" encoding="utf-8"?>
 <ds:datastoreItem xmlns:ds="http://schemas.openxmlformats.org/officeDocument/2006/customXml" ds:itemID="{10DB3269-8DE4-411B-88A4-A30630A315FA}">
   <ds:schemaRefs>
@@ -46382,6 +45624,41 @@
 </file>
 
 <file path=customXml/itemProps2.xml><?xml version="1.0" encoding="utf-8"?>
+<ds:datastoreItem xmlns:ds="http://schemas.openxmlformats.org/officeDocument/2006/customXml" ds:itemID="{648FEF1F-7785-4994-AB8C-CB93EB59F988}">
+  <ds:schemaRefs>
+    <ds:schemaRef ds:uri="http://schemas.openxmlformats.org/officeDocument/2006/bibliography"/>
+  </ds:schemaRefs>
+</ds:datastoreItem>
+</file>
+
+<file path=customXml/itemProps3.xml><?xml version="1.0" encoding="utf-8"?>
+<ds:datastoreItem xmlns:ds="http://schemas.openxmlformats.org/officeDocument/2006/customXml" ds:itemID="{FBF34A2D-2D71-4C6E-8637-4663568BE2C9}">
+  <ds:schemaRefs>
+    <ds:schemaRef ds:uri="http://schemas.microsoft.com/sharepoint/v3/contenttype/forms"/>
+  </ds:schemaRefs>
+</ds:datastoreItem>
+</file>
+
+<file path=customXml/itemProps4.xml><?xml version="1.0" encoding="utf-8"?>
+<ds:datastoreItem xmlns:ds="http://schemas.openxmlformats.org/officeDocument/2006/customXml" ds:itemID="{EE736932-0508-4817-9ACC-AFADBA55E7DF}">
+  <ds:schemaRefs>
+    <ds:schemaRef ds:uri="Microsoft.SharePoint.Taxonomy.ContentTypeSync"/>
+  </ds:schemaRefs>
+</ds:datastoreItem>
+</file>
+
+<file path=customXml/itemProps5.xml><?xml version="1.0" encoding="utf-8"?>
+<ds:datastoreItem xmlns:ds="http://schemas.openxmlformats.org/officeDocument/2006/customXml" ds:itemID="{B5ACEF89-02FA-4CE0-A8EE-2190E68A8CD1}">
+  <ds:schemaRefs>
+    <ds:schemaRef ds:uri="http://schemas.microsoft.com/office/2006/metadata/properties"/>
+    <ds:schemaRef ds:uri="http://schemas.microsoft.com/office/infopath/2007/PartnerControls"/>
+    <ds:schemaRef ds:uri="11a2a60f-b814-4d3a-805e-b33432740677"/>
+    <ds:schemaRef ds:uri="1d5818ac-eb98-46f9-9816-1a72176be1e5"/>
+  </ds:schemaRefs>
+</ds:datastoreItem>
+</file>
+
+<file path=customXml/itemProps6.xml><?xml version="1.0" encoding="utf-8"?>
 <ds:datastoreItem xmlns:ds="http://schemas.openxmlformats.org/officeDocument/2006/customXml" ds:itemID="{B8EAB9C3-60BE-413D-9628-8F8D86B8E7D7}">
   <ds:schemaRefs>
     <ds:schemaRef ds:uri="http://schemas.microsoft.com/office/2006/metadata/contentType"/>
@@ -46399,39 +45676,4 @@
     <ds:schemaRef ds:uri="http://schemas.microsoft.com/internal/obd"/>
   </ds:schemaRefs>
 </ds:datastoreItem>
-</file>
-
-<file path=customXml/itemProps3.xml><?xml version="1.0" encoding="utf-8"?>
-<ds:datastoreItem xmlns:ds="http://schemas.openxmlformats.org/officeDocument/2006/customXml" ds:itemID="{B5ACEF89-02FA-4CE0-A8EE-2190E68A8CD1}">
-  <ds:schemaRefs>
-    <ds:schemaRef ds:uri="http://schemas.microsoft.com/office/2006/metadata/properties"/>
-    <ds:schemaRef ds:uri="http://schemas.microsoft.com/office/infopath/2007/PartnerControls"/>
-    <ds:schemaRef ds:uri="11a2a60f-b814-4d3a-805e-b33432740677"/>
-    <ds:schemaRef ds:uri="1d5818ac-eb98-46f9-9816-1a72176be1e5"/>
-  </ds:schemaRefs>
-</ds:datastoreItem>
-</file>
-
-<file path=customXml/itemProps4.xml><?xml version="1.0" encoding="utf-8"?>
-<ds:datastoreItem xmlns:ds="http://schemas.openxmlformats.org/officeDocument/2006/customXml" ds:itemID="{EE736932-0508-4817-9ACC-AFADBA55E7DF}">
-  <ds:schemaRefs>
-    <ds:schemaRef ds:uri="Microsoft.SharePoint.Taxonomy.ContentTypeSync"/>
-  </ds:schemaRefs>
-</ds:datastoreItem>
-</file>
-
-<file path=customXml/itemProps5.xml><?xml version="1.0" encoding="utf-8"?>
-<ds:datastoreItem xmlns:ds="http://schemas.openxmlformats.org/officeDocument/2006/customXml" ds:itemID="{FBF34A2D-2D71-4C6E-8637-4663568BE2C9}">
-  <ds:schemaRefs>
-    <ds:schemaRef ds:uri="http://schemas.microsoft.com/sharepoint/v3/contenttype/forms"/>
-  </ds:schemaRefs>
-</ds:datastoreItem>
-</file>
-
-<file path=customXml/itemProps6.xml><?xml version="1.0" encoding="utf-8"?>
-<ds:datastoreItem xmlns:ds="http://schemas.openxmlformats.org/officeDocument/2006/customXml" ds:itemID="{648FEF1F-7785-4994-AB8C-CB93EB59F988}">
-  <ds:schemaRefs>
-    <ds:schemaRef ds:uri="http://schemas.openxmlformats.org/officeDocument/2006/bibliography"/>
-  </ds:schemaRefs>
-</ds:datastoreItem>
 </file>
</xml_diff>